<commit_message>
Ajusta o artigo ao estilo de escrita academico
Revisao pontual para alinhar o texto as convencoes de estilo, preservando a
estrutura e os resultados:

- Converte apartes com travessao para parenteses/virgulas no resumo.
- Remove floreios valorativos sem funcao analitica ("Mais expressivo ainda",
  "revelou-se especialmente instrutiva", "merece registro por seu valor
  ilustrativo", "merece comentario especifico"), substituindo-os por
  enunciados factuais diretos.
- Marca "valor justo" entre aspas na secao 4.4 e no Quadro 1, por ser termo
  importado das financas com carga conceitual disputavel; o corpo da secao ja
  emprega o neutro "valor esperado".

Regenerado o .docx.

Co-Authored-By: Claude Opus 4.8 (1M context) <noreply@anthropic.com>
</commit_message>
<xml_diff>
--- a/06_relatorios/artigo_cientifico_enap.docx
+++ b/06_relatorios/artigo_cientifico_enap.docx
@@ -85,7 +85,7 @@
           <w:i w:val="0"/>
           <w:sz w:val="24"/>
         </w:rPr>
-        <w:t xml:space="preserve"> e um sistema de inteligência para a reconstrução, voltado à alocação de recursos e à auditoria de gastos. A metodologia mobiliza técnicas de aprendizado de máquina — classificação, agrupamento, regressão quantílica e detecção de anomalias — aplicadas a registros oficiais, entre os quais 6.385 processos de reconstrução (2017-2025), que somam R$ 27,68 bilhões. Os resultados indicam que o tipo de desastre e a localização são os principais preditores de severidade; que municípios de baixa capacidade concentram 51% dos recursos e demandam valor médio 2,94 vezes superior ao dos de alta capacidade; que o comportamento real de demanda supera o rótulo oficial de capacidade; e que um modelo de triagem identificou 580 processos com valores potencialmente superdimensionados, evidenciando o potencial e os limites da auditoria algorítmica no setor público.</w:t>
+        <w:t xml:space="preserve"> e um sistema de inteligência para a reconstrução, voltado à alocação de recursos e à auditoria de gastos. A metodologia mobiliza técnicas de aprendizado de máquina (classificação, agrupamento, regressão quantílica e detecção de anomalias), aplicadas a registros oficiais, entre os quais 6.385 processos de reconstrução (2017-2025), que somam R$ 27,68 bilhões. Os resultados indicam que o tipo de desastre e a localização são os principais preditores de severidade; que municípios de baixa capacidade concentram 51% dos recursos e demandam valor médio 2,94 vezes superior ao dos de alta capacidade; que o comportamento real de demanda supera o rótulo oficial de capacidade; e que um modelo de triagem identificou 580 processos com valores potencialmente superdimensionados, evidenciando o potencial e os limites da auditoria algorítmica no setor público.</w:t>
       </w:r>
     </w:p>
     <w:p>
@@ -1120,7 +1120,7 @@
                 <w:i w:val="0"/>
                 <w:sz w:val="22"/>
               </w:rPr>
-              <w:t>Faixa de valor justo</w:t>
+              <w:t>Faixa de “valor justo”</w:t>
             </w:r>
           </w:p>
         </w:tc>
@@ -1393,7 +1393,7 @@
           <w:i w:val="0"/>
           <w:sz w:val="24"/>
         </w:rPr>
-        <w:t>A análise da distribuição dos valores por faixa de capacidade revela um padrão que contraria a intuição inicial. Os municípios classificados na faixa D, de baixa capacidade institucional, apresentam valor médio solicitado de R$ 28,68 milhões, ao passo que os municípios da faixa A, de alta capacidade, solicitam, em média, R$ 9,74 milhões. A razão entre os dois valores é de 2,94, o que significa que os municípios mais vulneráveis demandam, em média, quase três vezes mais recursos por processo do que os mais bem estruturados. Mais expressivo ainda é o fato de que a faixa D concentra 51% do total de recursos solicitados, embora reúna cerca de um quarto dos municípios analisados. Esse achado, que se poderia denominar paradoxo da capacidade institucional, constitui o ponto de partida das análises subsequentes.</w:t>
+        <w:t>A análise da distribuição dos valores por faixa de capacidade revela um padrão que contraria a intuição inicial. Os municípios classificados na faixa D, de baixa capacidade institucional, apresentam valor médio solicitado de R$ 28,68 milhões, ao passo que os municípios da faixa A, de alta capacidade, solicitam, em média, R$ 9,74 milhões. A razão entre os dois valores é de 2,94, o que significa que os municípios mais vulneráveis demandam, em média, quase três vezes mais recursos por processo do que os mais bem estruturados. A faixa D concentra, ademais, 51% do total de recursos solicitados, embora reúna cerca de um quarto dos municípios analisados. Esse achado, que se poderia denominar paradoxo da capacidade institucional, constitui o ponto de partida das análises subsequentes.</w:t>
       </w:r>
     </w:p>
     <w:p>
@@ -2486,7 +2486,7 @@
           <w:i w:val="0"/>
           <w:sz w:val="24"/>
         </w:rPr>
-        <w:t>O caso de Porto Alegre, isolado como grupo autônomo pelo agrupamento, merece registro por seu valor ilustrativo. A magnitude e a recorrência de suas solicitações, associadas aos eventos que atingiram a capital gaúcha, produziram um padrão de demanda sem paralelo no conjunto dos municípios, a ponto de a técnica de agrupamento o tratar como categoria própria. Esse resultado evidencia que os grandes centros urbanos podem concentrar, em um único ente, volumes de demanda comparáveis aos de regiões inteiras, o que tensiona os critérios uniformes de análise e sugere a conveniência de tratamentos diferenciados para casos de escala excepcional. Constata-se, assim, que a heterogeneidade dos municípios brasileiros se manifesta não apenas entre faixas de capacidade, mas também no interior de cada faixa, o que reforça a utilidade de abordagens que combinem a classificação estrutural à observação do comportamento.</w:t>
+        <w:t>O caso de Porto Alegre, isolado como grupo autônomo pelo agrupamento, ilustra os limites da análise uniforme. A magnitude e a recorrência de suas solicitações, associadas aos eventos que atingiram a capital gaúcha, produziram um padrão de demanda sem paralelo no conjunto dos municípios, a ponto de a técnica de agrupamento o tratar como categoria própria. Esse resultado evidencia que os grandes centros urbanos podem concentrar, em um único ente, volumes de demanda comparáveis aos de regiões inteiras, o que tensiona os critérios uniformes de análise e sugere a conveniência de tratamentos diferenciados para casos de escala excepcional. Constata-se, assim, que a heterogeneidade dos municípios brasileiros se manifesta não apenas entre faixas de capacidade, mas também no interior de cada faixa, o que reforça a utilidade de abordagens que combinem a classificação estrutural à observação do comportamento.</w:t>
       </w:r>
     </w:p>
     <w:p>
@@ -2535,7 +2535,7 @@
           <w:i w:val="0"/>
           <w:sz w:val="24"/>
         </w:rPr>
-        <w:t>A análise da importância das variáveis revelou-se especialmente instrutiva. O valor solicitado respondeu por 63% da importância total, consolidando-se como o determinante dominante da aprovação, o que sugere que solicitações muito afastadas do padrão enfrentam escrutínio diferenciado. O conjunto formado pela faixa populacional e pelo grupo comportamental respondeu por 15%, a unidade da federação por 10% e o tipo de desastre por 7%. A faixa de capacidade, por sua vez, respondeu por apenas 5% da importância, resultado que reforça o achado da fase anterior: o indicador oficial de capacidade pesa pouco na decisão quando comparado ao comportamento real do município, captado pelo grupo. Constata-se, assim, uma convergência entre as duas fases na relativização do poder explicativo do rótulo formal, convergência que, por derivar de técnicas distintas, confere maior solidez ao argumento central do estudo.</w:t>
+        <w:t>A análise da importância das variáveis expõe os determinantes da decisão. O valor solicitado respondeu por 63% da importância total, consolidando-se como o determinante dominante da aprovação, o que sugere que solicitações muito afastadas do padrão enfrentam escrutínio diferenciado. O conjunto formado pela faixa populacional e pelo grupo comportamental respondeu por 15%, a unidade da federação por 10% e o tipo de desastre por 7%. A faixa de capacidade, por sua vez, respondeu por apenas 5% da importância, resultado que reforça o achado da fase anterior: o indicador oficial de capacidade pesa pouco na decisão quando comparado ao comportamento real do município, captado pelo grupo. Constata-se, assim, uma convergência entre as duas fases na relativização do poder explicativo do rótulo formal, convergência que, por derivar de técnicas distintas, confere maior solidez ao argumento central do estudo.</w:t>
       </w:r>
     </w:p>
     <w:p>
@@ -2874,7 +2874,7 @@
           <w:i w:val="0"/>
           <w:sz w:val="24"/>
         </w:rPr>
-        <w:t>4.4 Estimativa de valor justo e auditoria automatizada</w:t>
+        <w:t>4.4 Estimativa de “valor justo” e auditoria automatizada</w:t>
       </w:r>
     </w:p>
     <w:p>
@@ -3902,7 +3902,7 @@
           <w:i w:val="0"/>
           <w:sz w:val="24"/>
         </w:rPr>
-        <w:t>O caso de Nova Monte Verde merece comentário específico, por sintetizar tanto a utilidade quanto os limites da auditoria automatizada. A magnitude do desvio, da ordem de 235.000%, torna implausível que se trate de uma solicitação genuína, apontando, com grande probabilidade, para um erro de digitação no registro do valor. Esse tipo de ocorrência, embora não configure irregularidade no sentido de má-fé, compromete a qualidade das bases de dados e pode distorcer estatísticas agregadas, como as médias por faixa discutidas anteriormente. Dessa maneira, a detecção automatizada presta um serviço duplo: além de sinalizar possíveis superfaturamentos, contribui para a depuração dos próprios dados administrativos, ao expor inconsistências que, de outro modo, permaneceriam ocultas no volume dos registros.</w:t>
+        <w:t>O caso de Nova Monte Verde sintetiza tanto a utilidade quanto os limites da auditoria automatizada. A magnitude do desvio, da ordem de 235.000%, torna implausível que se trate de uma solicitação genuína, apontando, com grande probabilidade, para um erro de digitação no registro do valor. Esse tipo de ocorrência, embora não configure irregularidade no sentido de má-fé, compromete a qualidade das bases de dados e pode distorcer estatísticas agregadas, como as médias por faixa discutidas anteriormente. Dessa maneira, a detecção automatizada presta um serviço duplo: além de sinalizar possíveis superfaturamentos, contribui para a depuração dos próprios dados administrativos, ao expor inconsistências que, de outro modo, permaneceriam ocultas no volume dos registros.</w:t>
       </w:r>
     </w:p>
     <w:p>

</xml_diff>

<commit_message>
Cita a fonte como serie de relatorios anuais (dados administrativos)
A base nao e um documento unico, mas 9 edicoes anuais da mesma serie
(Relatorio Gerencial de Reconstrucao - Acompanhamento de Processos, 2017-2025).
A referencia passa a declarar "Relatorios anuais. Dados administrativos" e o
intervalo 2017-2025 no lugar do ano unico; as chamadas no texto passam de
(BRASIL, 2025) para (BRASIL, 2017-2025), sinalizando a serie e nao um
documento avulso.

Co-Authored-By: Claude Opus 4.8 (1M context) <noreply@anthropic.com>
</commit_message>
<xml_diff>
--- a/06_relatorios/artigo_cientifico_enap.docx
+++ b/06_relatorios/artigo_cientifico_enap.docx
@@ -70,7 +70,7 @@
           <w:i w:val="0"/>
           <w:sz w:val="24"/>
         </w:rPr>
-        <w:t>Entre 2013 e 2024, os desastres provocaram cerca de R$ 732 bilhões em prejuízos no Brasil e atingiram 95% dos municípios, em um contexto de marcada heterogeneidade de capacidades estatais subnacionais. O artigo investiga por que municípios de menor capacidade institucional demandam mais recursos de reconstrução, se o comportamento efetivo de demanda supera o rótulo oficial de capacidade na explicação das decisões e em que medida técnicas de aprendizado de máquina permitem estimar valores de referência e sinalizar gastos atípicos. A metodologia mobiliza classificação, agrupamento, regressão quantílica e detecção de anomalias, aplicadas a 6.385 processos de reconstrução registrados entre 2017 e 2025 (BRASIL, 2025), que somam R$ 27,68 bilhões. Os resultados indicam que municípios de baixa capacidade concentram 51% dos recursos e demandam valor médio 2,94 vezes superior ao dos de alta capacidade; que o comportamento real de demanda supera o rótulo oficial de capacidade; e que um modelo de triagem identificou 580 processos com valores potencialmente superdimensionados, evidenciando o potencial e os limites da auditoria algorítmica no setor público. Como solução complementar, disponibiliza-se um motor de previsão da severidade dos desastres</w:t>
+        <w:t>Entre 2013 e 2024, os desastres provocaram cerca de R$ 732 bilhões em prejuízos no Brasil e atingiram 95% dos municípios, em um contexto de marcada heterogeneidade de capacidades estatais subnacionais. O artigo investiga por que municípios de menor capacidade institucional demandam mais recursos de reconstrução, se o comportamento efetivo de demanda supera o rótulo oficial de capacidade na explicação das decisões e em que medida técnicas de aprendizado de máquina permitem estimar valores de referência e sinalizar gastos atípicos. A metodologia mobiliza classificação, agrupamento, regressão quantílica e detecção de anomalias, aplicadas a 6.385 processos de reconstrução registrados entre 2017 e 2025 (BRASIL, 2017-2025), que somam R$ 27,68 bilhões. Os resultados indicam que municípios de baixa capacidade concentram 51% dos recursos e demandam valor médio 2,94 vezes superior ao dos de alta capacidade; que o comportamento real de demanda supera o rótulo oficial de capacidade; e que um modelo de triagem identificou 580 processos com valores potencialmente superdimensionados, evidenciando o potencial e os limites da auditoria algorítmica no setor público. Como solução complementar, disponibiliza-se um motor de previsão da severidade dos desastres</w:t>
       </w:r>
       <w:r>
         <w:rPr>
@@ -134,7 +134,7 @@
           <w:i w:val="0"/>
           <w:sz w:val="24"/>
         </w:rPr>
-        <w:t>Os desastres associados a eventos climáticos extremos deixaram de constituir ocorrências excepcionais no Brasil e passaram a integrar a agenda permanente da gestão pública. Inundações, enxurradas, deslizamentos e tempestades convectivas recorrentes impõem, ano após ano, a necessidade de mobilizar recursos federais para a reconstrução de infraestrutura urbana e de serviços essenciais em municípios atingidos. Entre 2017 e 2025, os relatórios gerenciais de acompanhamento de processos de reconstrução (BRASIL, 2025) reúnem 6.385 processos e R$ 27,68 bilhões em valores solicitados, distribuídos por 2.113 municípios e 26 unidades da federação. A magnitude desses números revela que a política de reconstrução pós-desastre opera em escala que exige instrumentos de gestão capazes de conciliar celeridade na resposta, equidade na alocação e controle sobre a aplicação dos recursos. Trata-se, portanto, de um campo em que as decisões administrativas produzem efeitos imediatos sobre populações fragilizadas, o que torna especialmente sensível qualquer ineficiência ou irregularidade na destinação dos valores.</w:t>
+        <w:t>Os desastres associados a eventos climáticos extremos deixaram de constituir ocorrências excepcionais no Brasil e passaram a integrar a agenda permanente da gestão pública. Inundações, enxurradas, deslizamentos e tempestades convectivas recorrentes impõem, ano após ano, a necessidade de mobilizar recursos federais para a reconstrução de infraestrutura urbana e de serviços essenciais em municípios atingidos. Entre 2017 e 2025, os relatórios gerenciais de acompanhamento de processos de reconstrução (BRASIL, 2017-2025) reúnem 6.385 processos e R$ 27,68 bilhões em valores solicitados, distribuídos por 2.113 municípios e 26 unidades da federação. A magnitude desses números revela que a política de reconstrução pós-desastre opera em escala que exige instrumentos de gestão capazes de conciliar celeridade na resposta, equidade na alocação e controle sobre a aplicação dos recursos. Trata-se, portanto, de um campo em que as decisões administrativas produzem efeitos imediatos sobre populações fragilizadas, o que torna especialmente sensível qualquer ineficiência ou irregularidade na destinação dos valores.</w:t>
       </w:r>
     </w:p>
     <w:p>
@@ -588,7 +588,7 @@
           <w:i w:val="0"/>
           <w:sz w:val="24"/>
         </w:rPr>
-        <w:t>O estudo apoia-se em duas bases de dados administrativos. A primeira corresponde aos relatórios gerenciais de acompanhamento de processos de reconstrução (BRASIL, 2025), abrangendo o período de 2017 a 2025, e reúne informações sobre unidade da federação, município, tipo de desastre, valor solicitado, situação do processo e datas de criação e solicitação. Após a consolidação, essa base totaliza 6.385 processos, distribuídos por 2.113 municípios, 26 unidades da federação e 29 tipos de desastre, somando R$ 27,68 bilhões em valores solicitados. A segunda base corresponde ao Índice de Capacidade Municipal (ICM), que classifica os municípios em quatro faixas de capacidade institucional, designadas de A (alta) a D (baixa), e que, após a limpeza, contempla 5.444 municípios. A natureza secundária e administrativa desses dados impõe que se reconheça, desde o início, a dependência do estudo em relação à qualidade do registro original.</w:t>
+        <w:t>O estudo apoia-se em duas bases de dados administrativos. A primeira corresponde aos relatórios gerenciais de acompanhamento de processos de reconstrução (BRASIL, 2017-2025), abrangendo o período de 2017 a 2025, e reúne informações sobre unidade da federação, município, tipo de desastre, valor solicitado, situação do processo e datas de criação e solicitação. Após a consolidação, essa base totaliza 6.385 processos, distribuídos por 2.113 municípios, 26 unidades da federação e 29 tipos de desastre, somando R$ 27,68 bilhões em valores solicitados. A segunda base corresponde ao Índice de Capacidade Municipal (ICM), que classifica os municípios em quatro faixas de capacidade institucional, designadas de A (alta) a D (baixa), e que, após a limpeza, contempla 5.444 municípios. A natureza secundária e administrativa desses dados impõe que se reconheça, desde o início, a dependência do estudo em relação à qualidade do registro original.</w:t>
       </w:r>
     </w:p>
     <w:p>
@@ -4532,7 +4532,7 @@
           <w:i w:val="0"/>
           <w:sz w:val="24"/>
         </w:rPr>
-        <w:t>BRASIL. Ministério da Integração e Desenvolvimento Regional. Secretaria Nacional de Proteção e Defesa Civil. Relatório gerencial de reconstrução: acompanhamento de processos, 2017-2025. Brasília, DF: MIDR, 2025.</w:t>
+        <w:t>BRASIL. Ministério da Integração e Desenvolvimento Regional. Secretaria Nacional de Proteção e Defesa Civil. Relatório gerencial de reconstrução: acompanhamento de processos. Brasília, DF: MIDR, 2017-2025. Relatórios anuais. Dados administrativos.</w:t>
       </w:r>
     </w:p>
     <w:p>

</xml_diff>

<commit_message>
Ajusta formatacao a norma RSP e anonimiza o artigo para avaliacao cega
- Pagina A4, margens 2,5/2,5/3/3 cm e numeracao de paginas no rodape.
- Remove os nomes dos autores (placeholder de autoria omitida) e todos os
  links do GitHub (titulo, notas de rodape e referencia do app de demo),
  substituidos por nota de URL omitida para avaliacao cega, a ser incluida no
  copidesque se aprovado.

Co-Authored-By: Claude Opus 4.8 (1M context) <noreply@anthropic.com>
</commit_message>
<xml_diff>
--- a/06_relatorios/artigo_cientifico_enap.docx
+++ b/06_relatorios/artigo_cientifico_enap.docx
@@ -34,10 +34,10 @@
         <w:rPr>
           <w:rFonts w:ascii="Times New Roman" w:hAnsi="Times New Roman" w:cs="Times New Roman"/>
           <w:b w:val="0"/>
-          <w:i w:val="0"/>
+          <w:i/>
           <w:sz w:val="22"/>
         </w:rPr>
-        <w:t>Tadeu Gomes Teixeira; Fábio Paim; Alexandre Galardinovic; Bruno Gustavo; Rafael Giacomin; Rafael Prata; Thiago Mello</w:t>
+        <w:t>[Identificação de autoria omitida para avaliação cega]</w:t>
       </w:r>
     </w:p>
     <w:p>
@@ -711,15 +711,15 @@
         <w:tblLook w:firstColumn="1" w:firstRow="1" w:lastColumn="0" w:lastRow="0" w:noHBand="0" w:noVBand="1" w:val="04A0"/>
       </w:tblPr>
       <w:tblGrid>
-        <w:gridCol w:w="2351"/>
-        <w:gridCol w:w="2351"/>
-        <w:gridCol w:w="2351"/>
-        <w:gridCol w:w="2351"/>
+        <w:gridCol w:w="2126"/>
+        <w:gridCol w:w="2126"/>
+        <w:gridCol w:w="2126"/>
+        <w:gridCol w:w="2126"/>
       </w:tblGrid>
       <w:tr>
         <w:tc>
           <w:tcPr>
-            <w:tcW w:type="dxa" w:w="2351"/>
+            <w:tcW w:type="dxa" w:w="2126"/>
           </w:tcPr>
           <w:p>
             <w:pPr>
@@ -740,7 +740,7 @@
         </w:tc>
         <w:tc>
           <w:tcPr>
-            <w:tcW w:type="dxa" w:w="2351"/>
+            <w:tcW w:type="dxa" w:w="2126"/>
           </w:tcPr>
           <w:p>
             <w:pPr>
@@ -761,7 +761,7 @@
         </w:tc>
         <w:tc>
           <w:tcPr>
-            <w:tcW w:type="dxa" w:w="2351"/>
+            <w:tcW w:type="dxa" w:w="2126"/>
           </w:tcPr>
           <w:p>
             <w:pPr>
@@ -782,7 +782,7 @@
         </w:tc>
         <w:tc>
           <w:tcPr>
-            <w:tcW w:type="dxa" w:w="2351"/>
+            <w:tcW w:type="dxa" w:w="2126"/>
           </w:tcPr>
           <w:p>
             <w:pPr>
@@ -805,7 +805,7 @@
       <w:tr>
         <w:tc>
           <w:tcPr>
-            <w:tcW w:type="dxa" w:w="2351"/>
+            <w:tcW w:type="dxa" w:w="2126"/>
           </w:tcPr>
           <w:p>
             <w:pPr>
@@ -826,7 +826,7 @@
         </w:tc>
         <w:tc>
           <w:tcPr>
-            <w:tcW w:type="dxa" w:w="2351"/>
+            <w:tcW w:type="dxa" w:w="2126"/>
           </w:tcPr>
           <w:p>
             <w:pPr>
@@ -847,7 +847,7 @@
         </w:tc>
         <w:tc>
           <w:tcPr>
-            <w:tcW w:type="dxa" w:w="2351"/>
+            <w:tcW w:type="dxa" w:w="2126"/>
           </w:tcPr>
           <w:p>
             <w:pPr>
@@ -868,7 +868,7 @@
         </w:tc>
         <w:tc>
           <w:tcPr>
-            <w:tcW w:type="dxa" w:w="2351"/>
+            <w:tcW w:type="dxa" w:w="2126"/>
           </w:tcPr>
           <w:p>
             <w:pPr>
@@ -891,7 +891,7 @@
       <w:tr>
         <w:tc>
           <w:tcPr>
-            <w:tcW w:type="dxa" w:w="2351"/>
+            <w:tcW w:type="dxa" w:w="2126"/>
           </w:tcPr>
           <w:p>
             <w:pPr>
@@ -912,7 +912,7 @@
         </w:tc>
         <w:tc>
           <w:tcPr>
-            <w:tcW w:type="dxa" w:w="2351"/>
+            <w:tcW w:type="dxa" w:w="2126"/>
           </w:tcPr>
           <w:p>
             <w:pPr>
@@ -933,7 +933,7 @@
         </w:tc>
         <w:tc>
           <w:tcPr>
-            <w:tcW w:type="dxa" w:w="2351"/>
+            <w:tcW w:type="dxa" w:w="2126"/>
           </w:tcPr>
           <w:p>
             <w:pPr>
@@ -954,7 +954,7 @@
         </w:tc>
         <w:tc>
           <w:tcPr>
-            <w:tcW w:type="dxa" w:w="2351"/>
+            <w:tcW w:type="dxa" w:w="2126"/>
           </w:tcPr>
           <w:p>
             <w:pPr>
@@ -977,7 +977,7 @@
       <w:tr>
         <w:tc>
           <w:tcPr>
-            <w:tcW w:type="dxa" w:w="2351"/>
+            <w:tcW w:type="dxa" w:w="2126"/>
           </w:tcPr>
           <w:p>
             <w:pPr>
@@ -998,7 +998,7 @@
         </w:tc>
         <w:tc>
           <w:tcPr>
-            <w:tcW w:type="dxa" w:w="2351"/>
+            <w:tcW w:type="dxa" w:w="2126"/>
           </w:tcPr>
           <w:p>
             <w:pPr>
@@ -1019,7 +1019,7 @@
         </w:tc>
         <w:tc>
           <w:tcPr>
-            <w:tcW w:type="dxa" w:w="2351"/>
+            <w:tcW w:type="dxa" w:w="2126"/>
           </w:tcPr>
           <w:p>
             <w:pPr>
@@ -1040,7 +1040,7 @@
         </w:tc>
         <w:tc>
           <w:tcPr>
-            <w:tcW w:type="dxa" w:w="2351"/>
+            <w:tcW w:type="dxa" w:w="2126"/>
           </w:tcPr>
           <w:p>
             <w:pPr>
@@ -1063,7 +1063,7 @@
       <w:tr>
         <w:tc>
           <w:tcPr>
-            <w:tcW w:type="dxa" w:w="2351"/>
+            <w:tcW w:type="dxa" w:w="2126"/>
           </w:tcPr>
           <w:p>
             <w:pPr>
@@ -1084,7 +1084,7 @@
         </w:tc>
         <w:tc>
           <w:tcPr>
-            <w:tcW w:type="dxa" w:w="2351"/>
+            <w:tcW w:type="dxa" w:w="2126"/>
           </w:tcPr>
           <w:p>
             <w:pPr>
@@ -1105,7 +1105,7 @@
         </w:tc>
         <w:tc>
           <w:tcPr>
-            <w:tcW w:type="dxa" w:w="2351"/>
+            <w:tcW w:type="dxa" w:w="2126"/>
           </w:tcPr>
           <w:p>
             <w:pPr>
@@ -1126,7 +1126,7 @@
         </w:tc>
         <w:tc>
           <w:tcPr>
-            <w:tcW w:type="dxa" w:w="2351"/>
+            <w:tcW w:type="dxa" w:w="2126"/>
           </w:tcPr>
           <w:p>
             <w:pPr>
@@ -1149,7 +1149,7 @@
       <w:tr>
         <w:tc>
           <w:tcPr>
-            <w:tcW w:type="dxa" w:w="2351"/>
+            <w:tcW w:type="dxa" w:w="2126"/>
           </w:tcPr>
           <w:p>
             <w:pPr>
@@ -1170,7 +1170,7 @@
         </w:tc>
         <w:tc>
           <w:tcPr>
-            <w:tcW w:type="dxa" w:w="2351"/>
+            <w:tcW w:type="dxa" w:w="2126"/>
           </w:tcPr>
           <w:p>
             <w:pPr>
@@ -1191,7 +1191,7 @@
         </w:tc>
         <w:tc>
           <w:tcPr>
-            <w:tcW w:type="dxa" w:w="2351"/>
+            <w:tcW w:type="dxa" w:w="2126"/>
           </w:tcPr>
           <w:p>
             <w:pPr>
@@ -1212,7 +1212,7 @@
         </w:tc>
         <w:tc>
           <w:tcPr>
-            <w:tcW w:type="dxa" w:w="2351"/>
+            <w:tcW w:type="dxa" w:w="2126"/>
           </w:tcPr>
           <w:p>
             <w:pPr>
@@ -1419,15 +1419,15 @@
         <w:tblLook w:firstColumn="1" w:firstRow="1" w:lastColumn="0" w:lastRow="0" w:noHBand="0" w:noVBand="1" w:val="04A0"/>
       </w:tblPr>
       <w:tblGrid>
-        <w:gridCol w:w="2351"/>
-        <w:gridCol w:w="2351"/>
-        <w:gridCol w:w="2351"/>
-        <w:gridCol w:w="2351"/>
+        <w:gridCol w:w="2126"/>
+        <w:gridCol w:w="2126"/>
+        <w:gridCol w:w="2126"/>
+        <w:gridCol w:w="2126"/>
       </w:tblGrid>
       <w:tr>
         <w:tc>
           <w:tcPr>
-            <w:tcW w:type="dxa" w:w="2351"/>
+            <w:tcW w:type="dxa" w:w="2126"/>
           </w:tcPr>
           <w:p>
             <w:pPr>
@@ -1448,7 +1448,7 @@
         </w:tc>
         <w:tc>
           <w:tcPr>
-            <w:tcW w:type="dxa" w:w="2351"/>
+            <w:tcW w:type="dxa" w:w="2126"/>
           </w:tcPr>
           <w:p>
             <w:pPr>
@@ -1469,7 +1469,7 @@
         </w:tc>
         <w:tc>
           <w:tcPr>
-            <w:tcW w:type="dxa" w:w="2351"/>
+            <w:tcW w:type="dxa" w:w="2126"/>
           </w:tcPr>
           <w:p>
             <w:pPr>
@@ -1490,7 +1490,7 @@
         </w:tc>
         <w:tc>
           <w:tcPr>
-            <w:tcW w:type="dxa" w:w="2351"/>
+            <w:tcW w:type="dxa" w:w="2126"/>
           </w:tcPr>
           <w:p>
             <w:pPr>
@@ -1513,7 +1513,7 @@
       <w:tr>
         <w:tc>
           <w:tcPr>
-            <w:tcW w:type="dxa" w:w="2351"/>
+            <w:tcW w:type="dxa" w:w="2126"/>
           </w:tcPr>
           <w:p>
             <w:pPr>
@@ -1534,7 +1534,7 @@
         </w:tc>
         <w:tc>
           <w:tcPr>
-            <w:tcW w:type="dxa" w:w="2351"/>
+            <w:tcW w:type="dxa" w:w="2126"/>
           </w:tcPr>
           <w:p>
             <w:pPr>
@@ -1555,7 +1555,7 @@
         </w:tc>
         <w:tc>
           <w:tcPr>
-            <w:tcW w:type="dxa" w:w="2351"/>
+            <w:tcW w:type="dxa" w:w="2126"/>
           </w:tcPr>
           <w:p>
             <w:pPr>
@@ -1576,7 +1576,7 @@
         </w:tc>
         <w:tc>
           <w:tcPr>
-            <w:tcW w:type="dxa" w:w="2351"/>
+            <w:tcW w:type="dxa" w:w="2126"/>
           </w:tcPr>
           <w:p>
             <w:pPr>
@@ -1599,7 +1599,7 @@
       <w:tr>
         <w:tc>
           <w:tcPr>
-            <w:tcW w:type="dxa" w:w="2351"/>
+            <w:tcW w:type="dxa" w:w="2126"/>
           </w:tcPr>
           <w:p>
             <w:pPr>
@@ -1620,7 +1620,7 @@
         </w:tc>
         <w:tc>
           <w:tcPr>
-            <w:tcW w:type="dxa" w:w="2351"/>
+            <w:tcW w:type="dxa" w:w="2126"/>
           </w:tcPr>
           <w:p>
             <w:pPr>
@@ -1641,7 +1641,7 @@
         </w:tc>
         <w:tc>
           <w:tcPr>
-            <w:tcW w:type="dxa" w:w="2351"/>
+            <w:tcW w:type="dxa" w:w="2126"/>
           </w:tcPr>
           <w:p>
             <w:pPr>
@@ -1662,7 +1662,7 @@
         </w:tc>
         <w:tc>
           <w:tcPr>
-            <w:tcW w:type="dxa" w:w="2351"/>
+            <w:tcW w:type="dxa" w:w="2126"/>
           </w:tcPr>
           <w:p>
             <w:pPr>
@@ -1685,7 +1685,7 @@
       <w:tr>
         <w:tc>
           <w:tcPr>
-            <w:tcW w:type="dxa" w:w="2351"/>
+            <w:tcW w:type="dxa" w:w="2126"/>
           </w:tcPr>
           <w:p>
             <w:pPr>
@@ -1706,7 +1706,7 @@
         </w:tc>
         <w:tc>
           <w:tcPr>
-            <w:tcW w:type="dxa" w:w="2351"/>
+            <w:tcW w:type="dxa" w:w="2126"/>
           </w:tcPr>
           <w:p>
             <w:pPr>
@@ -1727,7 +1727,7 @@
         </w:tc>
         <w:tc>
           <w:tcPr>
-            <w:tcW w:type="dxa" w:w="2351"/>
+            <w:tcW w:type="dxa" w:w="2126"/>
           </w:tcPr>
           <w:p>
             <w:pPr>
@@ -1748,7 +1748,7 @@
         </w:tc>
         <w:tc>
           <w:tcPr>
-            <w:tcW w:type="dxa" w:w="2351"/>
+            <w:tcW w:type="dxa" w:w="2126"/>
           </w:tcPr>
           <w:p>
             <w:pPr>
@@ -1771,7 +1771,7 @@
       <w:tr>
         <w:tc>
           <w:tcPr>
-            <w:tcW w:type="dxa" w:w="2351"/>
+            <w:tcW w:type="dxa" w:w="2126"/>
           </w:tcPr>
           <w:p>
             <w:pPr>
@@ -1792,7 +1792,7 @@
         </w:tc>
         <w:tc>
           <w:tcPr>
-            <w:tcW w:type="dxa" w:w="2351"/>
+            <w:tcW w:type="dxa" w:w="2126"/>
           </w:tcPr>
           <w:p>
             <w:pPr>
@@ -1813,7 +1813,7 @@
         </w:tc>
         <w:tc>
           <w:tcPr>
-            <w:tcW w:type="dxa" w:w="2351"/>
+            <w:tcW w:type="dxa" w:w="2126"/>
           </w:tcPr>
           <w:p>
             <w:pPr>
@@ -1834,7 +1834,7 @@
         </w:tc>
         <w:tc>
           <w:tcPr>
-            <w:tcW w:type="dxa" w:w="2351"/>
+            <w:tcW w:type="dxa" w:w="2126"/>
           </w:tcPr>
           <w:p>
             <w:pPr>
@@ -2006,15 +2006,15 @@
         <w:tblLook w:firstColumn="1" w:firstRow="1" w:lastColumn="0" w:lastRow="0" w:noHBand="0" w:noVBand="1" w:val="04A0"/>
       </w:tblPr>
       <w:tblGrid>
-        <w:gridCol w:w="2351"/>
-        <w:gridCol w:w="2351"/>
-        <w:gridCol w:w="2351"/>
-        <w:gridCol w:w="2351"/>
+        <w:gridCol w:w="2126"/>
+        <w:gridCol w:w="2126"/>
+        <w:gridCol w:w="2126"/>
+        <w:gridCol w:w="2126"/>
       </w:tblGrid>
       <w:tr>
         <w:tc>
           <w:tcPr>
-            <w:tcW w:type="dxa" w:w="2351"/>
+            <w:tcW w:type="dxa" w:w="2126"/>
           </w:tcPr>
           <w:p>
             <w:pPr>
@@ -2035,7 +2035,7 @@
         </w:tc>
         <w:tc>
           <w:tcPr>
-            <w:tcW w:type="dxa" w:w="2351"/>
+            <w:tcW w:type="dxa" w:w="2126"/>
           </w:tcPr>
           <w:p>
             <w:pPr>
@@ -2056,7 +2056,7 @@
         </w:tc>
         <w:tc>
           <w:tcPr>
-            <w:tcW w:type="dxa" w:w="2351"/>
+            <w:tcW w:type="dxa" w:w="2126"/>
           </w:tcPr>
           <w:p>
             <w:pPr>
@@ -2077,7 +2077,7 @@
         </w:tc>
         <w:tc>
           <w:tcPr>
-            <w:tcW w:type="dxa" w:w="2351"/>
+            <w:tcW w:type="dxa" w:w="2126"/>
           </w:tcPr>
           <w:p>
             <w:pPr>
@@ -2100,7 +2100,7 @@
       <w:tr>
         <w:tc>
           <w:tcPr>
-            <w:tcW w:type="dxa" w:w="2351"/>
+            <w:tcW w:type="dxa" w:w="2126"/>
           </w:tcPr>
           <w:p>
             <w:pPr>
@@ -2121,7 +2121,7 @@
         </w:tc>
         <w:tc>
           <w:tcPr>
-            <w:tcW w:type="dxa" w:w="2351"/>
+            <w:tcW w:type="dxa" w:w="2126"/>
           </w:tcPr>
           <w:p>
             <w:pPr>
@@ -2142,7 +2142,7 @@
         </w:tc>
         <w:tc>
           <w:tcPr>
-            <w:tcW w:type="dxa" w:w="2351"/>
+            <w:tcW w:type="dxa" w:w="2126"/>
           </w:tcPr>
           <w:p>
             <w:pPr>
@@ -2163,7 +2163,7 @@
         </w:tc>
         <w:tc>
           <w:tcPr>
-            <w:tcW w:type="dxa" w:w="2351"/>
+            <w:tcW w:type="dxa" w:w="2126"/>
           </w:tcPr>
           <w:p>
             <w:pPr>
@@ -2186,7 +2186,7 @@
       <w:tr>
         <w:tc>
           <w:tcPr>
-            <w:tcW w:type="dxa" w:w="2351"/>
+            <w:tcW w:type="dxa" w:w="2126"/>
           </w:tcPr>
           <w:p>
             <w:pPr>
@@ -2207,7 +2207,7 @@
         </w:tc>
         <w:tc>
           <w:tcPr>
-            <w:tcW w:type="dxa" w:w="2351"/>
+            <w:tcW w:type="dxa" w:w="2126"/>
           </w:tcPr>
           <w:p>
             <w:pPr>
@@ -2228,7 +2228,7 @@
         </w:tc>
         <w:tc>
           <w:tcPr>
-            <w:tcW w:type="dxa" w:w="2351"/>
+            <w:tcW w:type="dxa" w:w="2126"/>
           </w:tcPr>
           <w:p>
             <w:pPr>
@@ -2249,7 +2249,7 @@
         </w:tc>
         <w:tc>
           <w:tcPr>
-            <w:tcW w:type="dxa" w:w="2351"/>
+            <w:tcW w:type="dxa" w:w="2126"/>
           </w:tcPr>
           <w:p>
             <w:pPr>
@@ -2272,7 +2272,7 @@
       <w:tr>
         <w:tc>
           <w:tcPr>
-            <w:tcW w:type="dxa" w:w="2351"/>
+            <w:tcW w:type="dxa" w:w="2126"/>
           </w:tcPr>
           <w:p>
             <w:pPr>
@@ -2293,7 +2293,7 @@
         </w:tc>
         <w:tc>
           <w:tcPr>
-            <w:tcW w:type="dxa" w:w="2351"/>
+            <w:tcW w:type="dxa" w:w="2126"/>
           </w:tcPr>
           <w:p>
             <w:pPr>
@@ -2314,7 +2314,7 @@
         </w:tc>
         <w:tc>
           <w:tcPr>
-            <w:tcW w:type="dxa" w:w="2351"/>
+            <w:tcW w:type="dxa" w:w="2126"/>
           </w:tcPr>
           <w:p>
             <w:pPr>
@@ -2335,7 +2335,7 @@
         </w:tc>
         <w:tc>
           <w:tcPr>
-            <w:tcW w:type="dxa" w:w="2351"/>
+            <w:tcW w:type="dxa" w:w="2126"/>
           </w:tcPr>
           <w:p>
             <w:pPr>
@@ -2358,7 +2358,7 @@
       <w:tr>
         <w:tc>
           <w:tcPr>
-            <w:tcW w:type="dxa" w:w="2351"/>
+            <w:tcW w:type="dxa" w:w="2126"/>
           </w:tcPr>
           <w:p>
             <w:pPr>
@@ -2379,7 +2379,7 @@
         </w:tc>
         <w:tc>
           <w:tcPr>
-            <w:tcW w:type="dxa" w:w="2351"/>
+            <w:tcW w:type="dxa" w:w="2126"/>
           </w:tcPr>
           <w:p>
             <w:pPr>
@@ -2400,7 +2400,7 @@
         </w:tc>
         <w:tc>
           <w:tcPr>
-            <w:tcW w:type="dxa" w:w="2351"/>
+            <w:tcW w:type="dxa" w:w="2126"/>
           </w:tcPr>
           <w:p>
             <w:pPr>
@@ -2421,7 +2421,7 @@
         </w:tc>
         <w:tc>
           <w:tcPr>
-            <w:tcW w:type="dxa" w:w="2351"/>
+            <w:tcW w:type="dxa" w:w="2126"/>
           </w:tcPr>
           <w:p>
             <w:pPr>
@@ -2561,13 +2561,13 @@
         <w:tblLook w:firstColumn="1" w:firstRow="1" w:lastColumn="0" w:lastRow="0" w:noHBand="0" w:noVBand="1" w:val="04A0"/>
       </w:tblPr>
       <w:tblGrid>
-        <w:gridCol w:w="4702"/>
-        <w:gridCol w:w="4702"/>
+        <w:gridCol w:w="4252"/>
+        <w:gridCol w:w="4252"/>
       </w:tblGrid>
       <w:tr>
         <w:tc>
           <w:tcPr>
-            <w:tcW w:type="dxa" w:w="4702"/>
+            <w:tcW w:type="dxa" w:w="4252"/>
           </w:tcPr>
           <w:p>
             <w:pPr>
@@ -2588,7 +2588,7 @@
         </w:tc>
         <w:tc>
           <w:tcPr>
-            <w:tcW w:type="dxa" w:w="4702"/>
+            <w:tcW w:type="dxa" w:w="4252"/>
           </w:tcPr>
           <w:p>
             <w:pPr>
@@ -2611,7 +2611,7 @@
       <w:tr>
         <w:tc>
           <w:tcPr>
-            <w:tcW w:type="dxa" w:w="4702"/>
+            <w:tcW w:type="dxa" w:w="4252"/>
           </w:tcPr>
           <w:p>
             <w:pPr>
@@ -2632,7 +2632,7 @@
         </w:tc>
         <w:tc>
           <w:tcPr>
-            <w:tcW w:type="dxa" w:w="4702"/>
+            <w:tcW w:type="dxa" w:w="4252"/>
           </w:tcPr>
           <w:p>
             <w:pPr>
@@ -2655,7 +2655,7 @@
       <w:tr>
         <w:tc>
           <w:tcPr>
-            <w:tcW w:type="dxa" w:w="4702"/>
+            <w:tcW w:type="dxa" w:w="4252"/>
           </w:tcPr>
           <w:p>
             <w:pPr>
@@ -2676,7 +2676,7 @@
         </w:tc>
         <w:tc>
           <w:tcPr>
-            <w:tcW w:type="dxa" w:w="4702"/>
+            <w:tcW w:type="dxa" w:w="4252"/>
           </w:tcPr>
           <w:p>
             <w:pPr>
@@ -2699,7 +2699,7 @@
       <w:tr>
         <w:tc>
           <w:tcPr>
-            <w:tcW w:type="dxa" w:w="4702"/>
+            <w:tcW w:type="dxa" w:w="4252"/>
           </w:tcPr>
           <w:p>
             <w:pPr>
@@ -2720,7 +2720,7 @@
         </w:tc>
         <w:tc>
           <w:tcPr>
-            <w:tcW w:type="dxa" w:w="4702"/>
+            <w:tcW w:type="dxa" w:w="4252"/>
           </w:tcPr>
           <w:p>
             <w:pPr>
@@ -2743,7 +2743,7 @@
       <w:tr>
         <w:tc>
           <w:tcPr>
-            <w:tcW w:type="dxa" w:w="4702"/>
+            <w:tcW w:type="dxa" w:w="4252"/>
           </w:tcPr>
           <w:p>
             <w:pPr>
@@ -2764,7 +2764,7 @@
         </w:tc>
         <w:tc>
           <w:tcPr>
-            <w:tcW w:type="dxa" w:w="4702"/>
+            <w:tcW w:type="dxa" w:w="4252"/>
           </w:tcPr>
           <w:p>
             <w:pPr>
@@ -2787,7 +2787,7 @@
       <w:tr>
         <w:tc>
           <w:tcPr>
-            <w:tcW w:type="dxa" w:w="4702"/>
+            <w:tcW w:type="dxa" w:w="4252"/>
           </w:tcPr>
           <w:p>
             <w:pPr>
@@ -2808,7 +2808,7 @@
         </w:tc>
         <w:tc>
           <w:tcPr>
-            <w:tcW w:type="dxa" w:w="4702"/>
+            <w:tcW w:type="dxa" w:w="4252"/>
           </w:tcPr>
           <w:p>
             <w:pPr>
@@ -2948,15 +2948,15 @@
         <w:tblLook w:firstColumn="1" w:firstRow="1" w:lastColumn="0" w:lastRow="0" w:noHBand="0" w:noVBand="1" w:val="04A0"/>
       </w:tblPr>
       <w:tblGrid>
-        <w:gridCol w:w="2351"/>
-        <w:gridCol w:w="2351"/>
-        <w:gridCol w:w="2351"/>
-        <w:gridCol w:w="2351"/>
+        <w:gridCol w:w="2126"/>
+        <w:gridCol w:w="2126"/>
+        <w:gridCol w:w="2126"/>
+        <w:gridCol w:w="2126"/>
       </w:tblGrid>
       <w:tr>
         <w:tc>
           <w:tcPr>
-            <w:tcW w:type="dxa" w:w="2351"/>
+            <w:tcW w:type="dxa" w:w="2126"/>
           </w:tcPr>
           <w:p>
             <w:pPr>
@@ -2977,7 +2977,7 @@
         </w:tc>
         <w:tc>
           <w:tcPr>
-            <w:tcW w:type="dxa" w:w="2351"/>
+            <w:tcW w:type="dxa" w:w="2126"/>
           </w:tcPr>
           <w:p>
             <w:pPr>
@@ -2998,7 +2998,7 @@
         </w:tc>
         <w:tc>
           <w:tcPr>
-            <w:tcW w:type="dxa" w:w="2351"/>
+            <w:tcW w:type="dxa" w:w="2126"/>
           </w:tcPr>
           <w:p>
             <w:pPr>
@@ -3019,7 +3019,7 @@
         </w:tc>
         <w:tc>
           <w:tcPr>
-            <w:tcW w:type="dxa" w:w="2351"/>
+            <w:tcW w:type="dxa" w:w="2126"/>
           </w:tcPr>
           <w:p>
             <w:pPr>
@@ -3042,7 +3042,7 @@
       <w:tr>
         <w:tc>
           <w:tcPr>
-            <w:tcW w:type="dxa" w:w="2351"/>
+            <w:tcW w:type="dxa" w:w="2126"/>
           </w:tcPr>
           <w:p>
             <w:pPr>
@@ -3063,7 +3063,7 @@
         </w:tc>
         <w:tc>
           <w:tcPr>
-            <w:tcW w:type="dxa" w:w="2351"/>
+            <w:tcW w:type="dxa" w:w="2126"/>
           </w:tcPr>
           <w:p>
             <w:pPr>
@@ -3084,7 +3084,7 @@
         </w:tc>
         <w:tc>
           <w:tcPr>
-            <w:tcW w:type="dxa" w:w="2351"/>
+            <w:tcW w:type="dxa" w:w="2126"/>
           </w:tcPr>
           <w:p>
             <w:pPr>
@@ -3105,7 +3105,7 @@
         </w:tc>
         <w:tc>
           <w:tcPr>
-            <w:tcW w:type="dxa" w:w="2351"/>
+            <w:tcW w:type="dxa" w:w="2126"/>
           </w:tcPr>
           <w:p>
             <w:pPr>
@@ -3128,7 +3128,7 @@
       <w:tr>
         <w:tc>
           <w:tcPr>
-            <w:tcW w:type="dxa" w:w="2351"/>
+            <w:tcW w:type="dxa" w:w="2126"/>
           </w:tcPr>
           <w:p>
             <w:pPr>
@@ -3149,7 +3149,7 @@
         </w:tc>
         <w:tc>
           <w:tcPr>
-            <w:tcW w:type="dxa" w:w="2351"/>
+            <w:tcW w:type="dxa" w:w="2126"/>
           </w:tcPr>
           <w:p>
             <w:pPr>
@@ -3170,7 +3170,7 @@
         </w:tc>
         <w:tc>
           <w:tcPr>
-            <w:tcW w:type="dxa" w:w="2351"/>
+            <w:tcW w:type="dxa" w:w="2126"/>
           </w:tcPr>
           <w:p>
             <w:pPr>
@@ -3191,7 +3191,7 @@
         </w:tc>
         <w:tc>
           <w:tcPr>
-            <w:tcW w:type="dxa" w:w="2351"/>
+            <w:tcW w:type="dxa" w:w="2126"/>
           </w:tcPr>
           <w:p>
             <w:pPr>
@@ -3214,7 +3214,7 @@
       <w:tr>
         <w:tc>
           <w:tcPr>
-            <w:tcW w:type="dxa" w:w="2351"/>
+            <w:tcW w:type="dxa" w:w="2126"/>
           </w:tcPr>
           <w:p>
             <w:pPr>
@@ -3235,7 +3235,7 @@
         </w:tc>
         <w:tc>
           <w:tcPr>
-            <w:tcW w:type="dxa" w:w="2351"/>
+            <w:tcW w:type="dxa" w:w="2126"/>
           </w:tcPr>
           <w:p>
             <w:pPr>
@@ -3256,7 +3256,7 @@
         </w:tc>
         <w:tc>
           <w:tcPr>
-            <w:tcW w:type="dxa" w:w="2351"/>
+            <w:tcW w:type="dxa" w:w="2126"/>
           </w:tcPr>
           <w:p>
             <w:pPr>
@@ -3277,7 +3277,7 @@
         </w:tc>
         <w:tc>
           <w:tcPr>
-            <w:tcW w:type="dxa" w:w="2351"/>
+            <w:tcW w:type="dxa" w:w="2126"/>
           </w:tcPr>
           <w:p>
             <w:pPr>
@@ -3352,15 +3352,15 @@
         <w:tblLook w:firstColumn="1" w:firstRow="1" w:lastColumn="0" w:lastRow="0" w:noHBand="0" w:noVBand="1" w:val="04A0"/>
       </w:tblPr>
       <w:tblGrid>
-        <w:gridCol w:w="2351"/>
-        <w:gridCol w:w="2351"/>
-        <w:gridCol w:w="2351"/>
-        <w:gridCol w:w="2351"/>
+        <w:gridCol w:w="2126"/>
+        <w:gridCol w:w="2126"/>
+        <w:gridCol w:w="2126"/>
+        <w:gridCol w:w="2126"/>
       </w:tblGrid>
       <w:tr>
         <w:tc>
           <w:tcPr>
-            <w:tcW w:type="dxa" w:w="2351"/>
+            <w:tcW w:type="dxa" w:w="2126"/>
           </w:tcPr>
           <w:p>
             <w:pPr>
@@ -3381,7 +3381,7 @@
         </w:tc>
         <w:tc>
           <w:tcPr>
-            <w:tcW w:type="dxa" w:w="2351"/>
+            <w:tcW w:type="dxa" w:w="2126"/>
           </w:tcPr>
           <w:p>
             <w:pPr>
@@ -3402,7 +3402,7 @@
         </w:tc>
         <w:tc>
           <w:tcPr>
-            <w:tcW w:type="dxa" w:w="2351"/>
+            <w:tcW w:type="dxa" w:w="2126"/>
           </w:tcPr>
           <w:p>
             <w:pPr>
@@ -3423,7 +3423,7 @@
         </w:tc>
         <w:tc>
           <w:tcPr>
-            <w:tcW w:type="dxa" w:w="2351"/>
+            <w:tcW w:type="dxa" w:w="2126"/>
           </w:tcPr>
           <w:p>
             <w:pPr>
@@ -3446,7 +3446,7 @@
       <w:tr>
         <w:tc>
           <w:tcPr>
-            <w:tcW w:type="dxa" w:w="2351"/>
+            <w:tcW w:type="dxa" w:w="2126"/>
           </w:tcPr>
           <w:p>
             <w:pPr>
@@ -3467,7 +3467,7 @@
         </w:tc>
         <w:tc>
           <w:tcPr>
-            <w:tcW w:type="dxa" w:w="2351"/>
+            <w:tcW w:type="dxa" w:w="2126"/>
           </w:tcPr>
           <w:p>
             <w:pPr>
@@ -3488,7 +3488,7 @@
         </w:tc>
         <w:tc>
           <w:tcPr>
-            <w:tcW w:type="dxa" w:w="2351"/>
+            <w:tcW w:type="dxa" w:w="2126"/>
           </w:tcPr>
           <w:p>
             <w:pPr>
@@ -3509,7 +3509,7 @@
         </w:tc>
         <w:tc>
           <w:tcPr>
-            <w:tcW w:type="dxa" w:w="2351"/>
+            <w:tcW w:type="dxa" w:w="2126"/>
           </w:tcPr>
           <w:p>
             <w:pPr>
@@ -3532,7 +3532,7 @@
       <w:tr>
         <w:tc>
           <w:tcPr>
-            <w:tcW w:type="dxa" w:w="2351"/>
+            <w:tcW w:type="dxa" w:w="2126"/>
           </w:tcPr>
           <w:p>
             <w:pPr>
@@ -3553,7 +3553,7 @@
         </w:tc>
         <w:tc>
           <w:tcPr>
-            <w:tcW w:type="dxa" w:w="2351"/>
+            <w:tcW w:type="dxa" w:w="2126"/>
           </w:tcPr>
           <w:p>
             <w:pPr>
@@ -3574,7 +3574,7 @@
         </w:tc>
         <w:tc>
           <w:tcPr>
-            <w:tcW w:type="dxa" w:w="2351"/>
+            <w:tcW w:type="dxa" w:w="2126"/>
           </w:tcPr>
           <w:p>
             <w:pPr>
@@ -3595,7 +3595,7 @@
         </w:tc>
         <w:tc>
           <w:tcPr>
-            <w:tcW w:type="dxa" w:w="2351"/>
+            <w:tcW w:type="dxa" w:w="2126"/>
           </w:tcPr>
           <w:p>
             <w:pPr>
@@ -3618,7 +3618,7 @@
       <w:tr>
         <w:tc>
           <w:tcPr>
-            <w:tcW w:type="dxa" w:w="2351"/>
+            <w:tcW w:type="dxa" w:w="2126"/>
           </w:tcPr>
           <w:p>
             <w:pPr>
@@ -3639,7 +3639,7 @@
         </w:tc>
         <w:tc>
           <w:tcPr>
-            <w:tcW w:type="dxa" w:w="2351"/>
+            <w:tcW w:type="dxa" w:w="2126"/>
           </w:tcPr>
           <w:p>
             <w:pPr>
@@ -3660,7 +3660,7 @@
         </w:tc>
         <w:tc>
           <w:tcPr>
-            <w:tcW w:type="dxa" w:w="2351"/>
+            <w:tcW w:type="dxa" w:w="2126"/>
           </w:tcPr>
           <w:p>
             <w:pPr>
@@ -3681,7 +3681,7 @@
         </w:tc>
         <w:tc>
           <w:tcPr>
-            <w:tcW w:type="dxa" w:w="2351"/>
+            <w:tcW w:type="dxa" w:w="2126"/>
           </w:tcPr>
           <w:p>
             <w:pPr>
@@ -3704,7 +3704,7 @@
       <w:tr>
         <w:tc>
           <w:tcPr>
-            <w:tcW w:type="dxa" w:w="2351"/>
+            <w:tcW w:type="dxa" w:w="2126"/>
           </w:tcPr>
           <w:p>
             <w:pPr>
@@ -3725,7 +3725,7 @@
         </w:tc>
         <w:tc>
           <w:tcPr>
-            <w:tcW w:type="dxa" w:w="2351"/>
+            <w:tcW w:type="dxa" w:w="2126"/>
           </w:tcPr>
           <w:p>
             <w:pPr>
@@ -3746,7 +3746,7 @@
         </w:tc>
         <w:tc>
           <w:tcPr>
-            <w:tcW w:type="dxa" w:w="2351"/>
+            <w:tcW w:type="dxa" w:w="2126"/>
           </w:tcPr>
           <w:p>
             <w:pPr>
@@ -3767,7 +3767,7 @@
         </w:tc>
         <w:tc>
           <w:tcPr>
-            <w:tcW w:type="dxa" w:w="2351"/>
+            <w:tcW w:type="dxa" w:w="2126"/>
           </w:tcPr>
           <w:p>
             <w:pPr>
@@ -3790,7 +3790,7 @@
       <w:tr>
         <w:tc>
           <w:tcPr>
-            <w:tcW w:type="dxa" w:w="2351"/>
+            <w:tcW w:type="dxa" w:w="2126"/>
           </w:tcPr>
           <w:p>
             <w:pPr>
@@ -3811,7 +3811,7 @@
         </w:tc>
         <w:tc>
           <w:tcPr>
-            <w:tcW w:type="dxa" w:w="2351"/>
+            <w:tcW w:type="dxa" w:w="2126"/>
           </w:tcPr>
           <w:p>
             <w:pPr>
@@ -3832,7 +3832,7 @@
         </w:tc>
         <w:tc>
           <w:tcPr>
-            <w:tcW w:type="dxa" w:w="2351"/>
+            <w:tcW w:type="dxa" w:w="2126"/>
           </w:tcPr>
           <w:p>
             <w:pPr>
@@ -3853,7 +3853,7 @@
         </w:tc>
         <w:tc>
           <w:tcPr>
-            <w:tcW w:type="dxa" w:w="2351"/>
+            <w:tcW w:type="dxa" w:w="2126"/>
           </w:tcPr>
           <w:p>
             <w:pPr>
@@ -3977,13 +3977,13 @@
         <w:tblLook w:firstColumn="1" w:firstRow="1" w:lastColumn="0" w:lastRow="0" w:noHBand="0" w:noVBand="1" w:val="04A0"/>
       </w:tblPr>
       <w:tblGrid>
-        <w:gridCol w:w="4702"/>
-        <w:gridCol w:w="4702"/>
+        <w:gridCol w:w="4252"/>
+        <w:gridCol w:w="4252"/>
       </w:tblGrid>
       <w:tr>
         <w:tc>
           <w:tcPr>
-            <w:tcW w:type="dxa" w:w="4702"/>
+            <w:tcW w:type="dxa" w:w="4252"/>
           </w:tcPr>
           <w:p>
             <w:pPr>
@@ -4004,7 +4004,7 @@
         </w:tc>
         <w:tc>
           <w:tcPr>
-            <w:tcW w:type="dxa" w:w="4702"/>
+            <w:tcW w:type="dxa" w:w="4252"/>
           </w:tcPr>
           <w:p>
             <w:pPr>
@@ -4027,7 +4027,7 @@
       <w:tr>
         <w:tc>
           <w:tcPr>
-            <w:tcW w:type="dxa" w:w="4702"/>
+            <w:tcW w:type="dxa" w:w="4252"/>
           </w:tcPr>
           <w:p>
             <w:pPr>
@@ -4048,7 +4048,7 @@
         </w:tc>
         <w:tc>
           <w:tcPr>
-            <w:tcW w:type="dxa" w:w="4702"/>
+            <w:tcW w:type="dxa" w:w="4252"/>
           </w:tcPr>
           <w:p>
             <w:pPr>
@@ -4071,7 +4071,7 @@
       <w:tr>
         <w:tc>
           <w:tcPr>
-            <w:tcW w:type="dxa" w:w="4702"/>
+            <w:tcW w:type="dxa" w:w="4252"/>
           </w:tcPr>
           <w:p>
             <w:pPr>
@@ -4092,7 +4092,7 @@
         </w:tc>
         <w:tc>
           <w:tcPr>
-            <w:tcW w:type="dxa" w:w="4702"/>
+            <w:tcW w:type="dxa" w:w="4252"/>
           </w:tcPr>
           <w:p>
             <w:pPr>
@@ -4115,7 +4115,7 @@
       <w:tr>
         <w:tc>
           <w:tcPr>
-            <w:tcW w:type="dxa" w:w="4702"/>
+            <w:tcW w:type="dxa" w:w="4252"/>
           </w:tcPr>
           <w:p>
             <w:pPr>
@@ -4136,7 +4136,7 @@
         </w:tc>
         <w:tc>
           <w:tcPr>
-            <w:tcW w:type="dxa" w:w="4702"/>
+            <w:tcW w:type="dxa" w:w="4252"/>
           </w:tcPr>
           <w:p>
             <w:pPr>
@@ -4159,7 +4159,7 @@
       <w:tr>
         <w:tc>
           <w:tcPr>
-            <w:tcW w:type="dxa" w:w="4702"/>
+            <w:tcW w:type="dxa" w:w="4252"/>
           </w:tcPr>
           <w:p>
             <w:pPr>
@@ -4180,7 +4180,7 @@
         </w:tc>
         <w:tc>
           <w:tcPr>
-            <w:tcW w:type="dxa" w:w="4702"/>
+            <w:tcW w:type="dxa" w:w="4252"/>
           </w:tcPr>
           <w:p>
             <w:pPr>
@@ -4203,7 +4203,7 @@
       <w:tr>
         <w:tc>
           <w:tcPr>
-            <w:tcW w:type="dxa" w:w="4702"/>
+            <w:tcW w:type="dxa" w:w="4252"/>
           </w:tcPr>
           <w:p>
             <w:pPr>
@@ -4224,7 +4224,7 @@
         </w:tc>
         <w:tc>
           <w:tcPr>
-            <w:tcW w:type="dxa" w:w="4702"/>
+            <w:tcW w:type="dxa" w:w="4252"/>
           </w:tcPr>
           <w:p>
             <w:pPr>
@@ -4628,22 +4628,6 @@
           <w:i w:val="0"/>
           <w:sz w:val="24"/>
         </w:rPr>
-        <w:t>EQUIPE 5 - INFRAESTRUTURA. Modelo preditivo de severidade de desastres para a defesa civil: aplicação de demonstração. [S. l.], 2025. Disponível em: https://github.com/fabiokp/defesa_civil_deploy. Acesso em: 23 jun. 2026.</w:t>
-      </w:r>
-    </w:p>
-    <w:p>
-      <w:pPr>
-        <w:spacing w:line="240" w:lineRule="auto" w:after="120"/>
-        <w:ind w:firstLine="0"/>
-        <w:jc w:val="both"/>
-      </w:pPr>
-      <w:r>
-        <w:rPr>
-          <w:rFonts w:ascii="Times New Roman" w:hAnsi="Times New Roman" w:cs="Times New Roman"/>
-          <w:b w:val="0"/>
-          <w:i w:val="0"/>
-          <w:sz w:val="24"/>
-        </w:rPr>
         <w:t>FRIEDMAN, Jerome H. Greedy function approximation: a gradient boosting machine. The Annals of Statistics, v. 29, n. 5, p. 1189-1232, 2001.</w:t>
       </w:r>
     </w:p>
@@ -4772,6 +4756,22 @@
           <w:i w:val="0"/>
           <w:sz w:val="24"/>
         </w:rPr>
+        <w:t>MODELO preditivo de severidade de desastres para a defesa civil: aplicação de demonstração. [S. l.], 2025. URL omitida para avaliação cega; será incluída na fase de copidesque, caso o artigo seja aprovado.</w:t>
+      </w:r>
+    </w:p>
+    <w:p>
+      <w:pPr>
+        <w:spacing w:line="240" w:lineRule="auto" w:after="120"/>
+        <w:ind w:firstLine="0"/>
+        <w:jc w:val="both"/>
+      </w:pPr>
+      <w:r>
+        <w:rPr>
+          <w:rFonts w:ascii="Times New Roman" w:hAnsi="Times New Roman" w:cs="Times New Roman"/>
+          <w:b w:val="0"/>
+          <w:i w:val="0"/>
+          <w:sz w:val="24"/>
+        </w:rPr>
         <w:t>SPECK, Bruno Wilhelm (org.). Caminhos da transparência: análise dos componentes de um sistema nacional de integridade. Campinas: Editora da Unicamp, 2002.</w:t>
       </w:r>
     </w:p>
@@ -4792,13 +4792,34 @@
       </w:r>
     </w:p>
     <w:sectPr>
-      <w:pgSz w:w="12240" w:h="15840"/>
-      <w:pgMar w:top="1701" w:right="1134" w:bottom="1134" w:left="1701" w:header="720" w:footer="720" w:gutter="0"/>
+      <w:footerReference w:type="default" r:id="rId9"/>
+      <w:pgSz w:w="11906" w:h="16838"/>
+      <w:pgMar w:top="1417" w:right="1701" w:bottom="1417" w:left="1701" w:header="720" w:footer="720" w:gutter="0"/>
       <w:cols w:space="720"/>
       <w:docGrid w:linePitch="360"/>
     </w:sectPr>
   </w:body>
 </w:document>
+</file>
+
+<file path=word/footer1.xml><?xml version="1.0" encoding="utf-8"?>
+<w:ftr xmlns:m="http://schemas.openxmlformats.org/officeDocument/2006/math" xmlns:mc="http://schemas.openxmlformats.org/markup-compatibility/2006" xmlns:mo="http://schemas.microsoft.com/office/mac/office/2008/main" xmlns:mv="urn:schemas-microsoft-com:mac:vml" xmlns:o="urn:schemas-microsoft-com:office:office" xmlns:r="http://schemas.openxmlformats.org/officeDocument/2006/relationships" xmlns:v="urn:schemas-microsoft-com:vml" xmlns:w10="urn:schemas-microsoft-com:office:word" xmlns:w14="http://schemas.microsoft.com/office/word/2010/wordml" xmlns:w="http://schemas.openxmlformats.org/wordprocessingml/2006/main" xmlns:wne="http://schemas.microsoft.com/office/word/2006/wordml" xmlns:wp14="http://schemas.microsoft.com/office/word/2010/wordprocessingDrawing" xmlns:wp="http://schemas.openxmlformats.org/drawingml/2006/wordprocessingDrawing" xmlns:wpc="http://schemas.microsoft.com/office/word/2010/wordprocessingCanvas" xmlns:wpg="http://schemas.microsoft.com/office/word/2010/wordprocessingGroup" xmlns:wpi="http://schemas.microsoft.com/office/word/2010/wordprocessingInk" xmlns:wps="http://schemas.microsoft.com/office/word/2010/wordprocessingShape" mc:Ignorable="w14 wp14">
+  <w:p>
+    <w:pPr>
+      <w:pStyle w:val="Footer"/>
+      <w:jc w:val="center"/>
+    </w:pPr>
+    <w:r>
+      <w:rPr>
+        <w:rFonts w:ascii="Times New Roman" w:hAnsi="Times New Roman"/>
+        <w:sz w:val="20"/>
+      </w:rPr>
+      <w:fldChar w:fldCharType="begin"/>
+      <w:instrText xml:space="preserve">PAGE</w:instrText>
+      <w:fldChar w:fldCharType="end"/>
+    </w:r>
+  </w:p>
+</w:ftr>
 </file>
 
 <file path=word/footnotes.xml><?xml version="1.0" encoding="utf-8"?>
@@ -4831,7 +4852,7 @@
           <w:rFonts w:ascii="Times New Roman" w:hAnsi="Times New Roman"/>
           <w:sz w:val="20"/>
         </w:rPr>
-        <w:t xml:space="preserve"> Repositório do projeto disponível em: https://github.com/tadeugomes/enap-encontro-infra.</w:t>
+        <w:t xml:space="preserve"> Repositório do projeto, com o código-fonte, os dados de trabalho e os artefatos de saída. URL omitida para avaliação cega; será incluída na fase de copidesque, caso o artigo seja aprovado.</w:t>
       </w:r>
     </w:p>
   </w:footnote>
@@ -4849,7 +4870,7 @@
           <w:rFonts w:ascii="Times New Roman" w:hAnsi="Times New Roman"/>
           <w:sz w:val="20"/>
         </w:rPr>
-        <w:t xml:space="preserve"> Aplicação de demonstração do modelo preditivo de severidade disponível em: https://github.com/fabiokp/defesa_civil_deploy.</w:t>
+        <w:t xml:space="preserve"> Aplicação de demonstração do modelo preditivo de severidade, de acesso público. URL omitida para avaliação cega; será incluída na fase de copidesque, caso o artigo seja aprovado.</w:t>
       </w:r>
     </w:p>
   </w:footnote>

</xml_diff>

<commit_message>
Enxuga o artigo e adiciona resumos trilingues para a RSP
- Corte de 1.105 palavras no corpo (9.184 -> 8.079), concentrado em
  redundancia entre Resultados, Discussao e Consideracoes finais e em
  passagens descritivas do referencial e da metodologia; preservados dados,
  tabelas, citacoes e os paragrafos de etica e limitacoes.
- Titulo, resumo e palavras-chave passam a constar em portugues, espanhol e
  ingles (norma RSP); cada resumo abaixo de 200 palavras (PT 192, ES 200,
  EN 163).
- Total final de 8.521 palavras, levemente acima do teto de 8.000 da RSP.

Co-Authored-By: Claude Opus 4.8 (1M context) <noreply@anthropic.com>
</commit_message>
<xml_diff>
--- a/06_relatorios/artigo_cientifico_enap.docx
+++ b/06_relatorios/artigo_cientifico_enap.docx
@@ -22,6 +22,38 @@
           <w:vertAlign w:val="superscript"/>
         </w:rPr>
         <w:footnoteReference w:id="1"/>
+      </w:r>
+    </w:p>
+    <w:p>
+      <w:pPr>
+        <w:spacing w:line="360" w:lineRule="auto" w:after="120" w:before="0"/>
+        <w:ind w:firstLine="0"/>
+        <w:jc w:val="center"/>
+      </w:pPr>
+      <w:r>
+        <w:rPr>
+          <w:rFonts w:ascii="Times New Roman" w:hAnsi="Times New Roman" w:cs="Times New Roman"/>
+          <w:b/>
+          <w:i w:val="0"/>
+          <w:sz w:val="22"/>
+        </w:rPr>
+        <w:t>Inteligencia artificial en la gestión de recursos de reconstrucción posdesastre: capacidad municipal, comportamiento de la demanda y auditoría automatizada del gasto público en Brasil (2017-2025)</w:t>
+      </w:r>
+    </w:p>
+    <w:p>
+      <w:pPr>
+        <w:spacing w:line="360" w:lineRule="auto" w:after="240" w:before="0"/>
+        <w:ind w:firstLine="0"/>
+        <w:jc w:val="center"/>
+      </w:pPr>
+      <w:r>
+        <w:rPr>
+          <w:rFonts w:ascii="Times New Roman" w:hAnsi="Times New Roman" w:cs="Times New Roman"/>
+          <w:b/>
+          <w:i w:val="0"/>
+          <w:sz w:val="22"/>
+        </w:rPr>
+        <w:t>Artificial intelligence in the management of post-disaster reconstruction resources: municipal capacity, demand behavior, and automated auditing of public spending in Brazil (2017-2025)</w:t>
       </w:r>
     </w:p>
     <w:p>
@@ -118,6 +150,104 @@
           <w:i w:val="0"/>
           <w:sz w:val="24"/>
         </w:rPr>
+        <w:t>Resumen</w:t>
+      </w:r>
+    </w:p>
+    <w:p>
+      <w:pPr>
+        <w:spacing w:line="360" w:lineRule="auto" w:after="0" w:before="0"/>
+        <w:ind w:firstLine="0"/>
+        <w:jc w:val="both"/>
+      </w:pPr>
+      <w:r>
+        <w:rPr>
+          <w:rFonts w:ascii="Times New Roman" w:hAnsi="Times New Roman" w:cs="Times New Roman"/>
+          <w:b w:val="0"/>
+          <w:i w:val="0"/>
+          <w:sz w:val="24"/>
+        </w:rPr>
+        <w:t>Entre 2013 y 2024, los desastres provocaron cerca de R$ 732 mil millones en pérdidas en Brasil y afectaron al 95% de los municipios, en un contexto de marcada heterogeneidad de las capacidades estatales subnacionales. El artículo investiga por qué los municipios de menor capacidad institucional demandan más recursos de reconstrucción, si el comportamiento efectivo de la demanda supera la clasificación oficial de capacidad en la explicación de las decisiones y en qué medida las técnicas de aprendizaje automático permiten estimar valores de referencia y señalar gastos atípicos. La metodología moviliza clasificación, agrupamiento, regresión cuantílica y detección de anomalías, aplicadas a 6.385 procesos de reconstrucción registrados entre 2017 y 2025 (BRASIL, 2017-2025), que suman R$ 27,68 mil millones. Los resultados indican que los municipios de baja capacidad concentran el 51% de los recursos y demandan un valor medio 2,94 veces superior al de los de alta capacidad; que el comportamiento real de la demanda supera la clasificación oficial; y que un modelo de cribado identificó 580 procesos con valores potencialmente sobredimensionados, evidenciando el potencial y los límites de la auditoría algorítmica en el sector público. Como solución complementaria, se ofrece un motor de predicción de la severidad de los desastres.</w:t>
+      </w:r>
+    </w:p>
+    <w:p>
+      <w:pPr>
+        <w:spacing w:line="360" w:lineRule="auto" w:after="0" w:before="120"/>
+        <w:ind w:firstLine="0"/>
+        <w:jc w:val="both"/>
+      </w:pPr>
+      <w:r>
+        <w:rPr>
+          <w:rFonts w:ascii="Times New Roman" w:hAnsi="Times New Roman" w:cs="Times New Roman"/>
+          <w:b w:val="0"/>
+          <w:i w:val="0"/>
+          <w:sz w:val="24"/>
+        </w:rPr>
+        <w:t>Palabras clave: capacidad estatal municipal; gestión de desastres; aprendizaje automático; predicción de desastres; auditoría del gasto público.</w:t>
+      </w:r>
+    </w:p>
+    <w:p>
+      <w:pPr>
+        <w:keepNext/>
+        <w:spacing w:line="360" w:lineRule="auto" w:before="240" w:after="120"/>
+        <w:ind w:firstLine="0"/>
+        <w:jc w:val="left"/>
+      </w:pPr>
+      <w:r>
+        <w:rPr>
+          <w:rFonts w:ascii="Times New Roman" w:hAnsi="Times New Roman" w:cs="Times New Roman"/>
+          <w:b/>
+          <w:i w:val="0"/>
+          <w:sz w:val="24"/>
+        </w:rPr>
+        <w:t>Abstract</w:t>
+      </w:r>
+    </w:p>
+    <w:p>
+      <w:pPr>
+        <w:spacing w:line="360" w:lineRule="auto" w:after="0" w:before="0"/>
+        <w:ind w:firstLine="0"/>
+        <w:jc w:val="both"/>
+      </w:pPr>
+      <w:r>
+        <w:rPr>
+          <w:rFonts w:ascii="Times New Roman" w:hAnsi="Times New Roman" w:cs="Times New Roman"/>
+          <w:b w:val="0"/>
+          <w:i w:val="0"/>
+          <w:sz w:val="24"/>
+        </w:rPr>
+        <w:t>Between 2013 and 2024, disasters caused about R$ 732 billion in losses in Brazil and affected 95% of municipalities, in a context of marked heterogeneity of subnational state capacities. This article investigates why municipalities with lower institutional capacity demand more reconstruction resources, whether the actual demand behavior outperforms the official capacity label in explaining decisions, and to what extent machine learning techniques allow estimating reference values and flagging atypical spending. The methodology employs classification, clustering, quantile regression, and anomaly detection, applied to 6,385 reconstruction cases recorded between 2017 and 2025 (BRASIL, 2017-2025), totaling R$ 27.68 billion. The results indicate that low-capacity municipalities concentrate 51% of resources and demand an average value 2.94 times higher than high-capacity ones; that actual demand behavior outperforms the official capacity label; and that a screening model identified 580 cases with potentially oversized values, revealing the potential and the limits of algorithmic auditing in the public sector. As a complementary solution, a disaster severity prediction engine is made available.</w:t>
+      </w:r>
+    </w:p>
+    <w:p>
+      <w:pPr>
+        <w:spacing w:line="360" w:lineRule="auto" w:after="0" w:before="120"/>
+        <w:ind w:firstLine="0"/>
+        <w:jc w:val="both"/>
+      </w:pPr>
+      <w:r>
+        <w:rPr>
+          <w:rFonts w:ascii="Times New Roman" w:hAnsi="Times New Roman" w:cs="Times New Roman"/>
+          <w:b w:val="0"/>
+          <w:i w:val="0"/>
+          <w:sz w:val="24"/>
+        </w:rPr>
+        <w:t>Keywords: municipal state capacity; disaster management; machine learning; disaster prediction; public spending audit.</w:t>
+      </w:r>
+    </w:p>
+    <w:p>
+      <w:pPr>
+        <w:keepNext/>
+        <w:spacing w:line="360" w:lineRule="auto" w:before="240" w:after="120"/>
+        <w:ind w:firstLine="0"/>
+        <w:jc w:val="left"/>
+      </w:pPr>
+      <w:r>
+        <w:rPr>
+          <w:rFonts w:ascii="Times New Roman" w:hAnsi="Times New Roman" w:cs="Times New Roman"/>
+          <w:b/>
+          <w:i w:val="0"/>
+          <w:sz w:val="24"/>
+        </w:rPr>
         <w:t>1 Introdução</w:t>
       </w:r>
     </w:p>
@@ -150,7 +280,7 @@
           <w:i w:val="0"/>
           <w:sz w:val="24"/>
         </w:rPr>
-        <w:t>A dimensão do problema, no plano nacional, é expressiva. Segundo o Panorama dos Desastres no Brasil, da Confederação Nacional de Municípios, entre 2013 e 2024 os desastres provocaram cerca de R$ 732,2 bilhões em prejuízos econômicos e atingiram 95% dos municípios brasileiros, que registraram 70.361 decretos de situação de emergência ou de calamidade pública (CONFEDERAÇÃO NACIONAL DE MUNICÍPIOS, 2025). No mesmo período, as decretações de anormalidade cresceram 64%, mesmo quando excluídos os registros associados à pandemia de Covid-19. O impacto humano acompanha essa escala: foram contabilizados 2.978 óbitos, mais de um milhão de desabrigados e cerca de cinco milhões de desalojados, com os danos econômicos concentrados em dois extremos climáticos, a seca e o excesso de chuvas, que respondem, somados, por 68,9% das decretações de anormalidade no país.</w:t>
+        <w:t>A dimensão do problema, no plano nacional, é expressiva. Segundo o Panorama dos Desastres no Brasil, da Confederação Nacional de Municípios, entre 2013 e 2024 os desastres provocaram cerca de R$ 732,2 bilhões em prejuízos econômicos e atingiram 95% dos municípios brasileiros, que registraram 70.361 decretos de situação de emergência ou de calamidade pública (CONFEDERAÇÃO NACIONAL DE MUNICÍPIOS, 2025). No mesmo período, as decretações de anormalidade cresceram 64%, mesmo excluídos os registros associados à pandemia de Covid-19, e os danos concentraram-se em dois extremos climáticos, a seca e o excesso de chuvas, responsáveis somados por 68,9% das decretações no país.</w:t>
       </w:r>
     </w:p>
     <w:p>
@@ -182,7 +312,7 @@
           <w:i w:val="0"/>
           <w:sz w:val="24"/>
         </w:rPr>
-        <w:t>A capacidade de um município responder a um desastre, contudo, não se distribui de maneira uniforme pelo território nacional. A literatura sobre capacidades estatais subnacionais tem demonstrado que os municípios brasileiros apresentam dotações muito desiguais de recursos administrativos, fiscais e técnicos, o que condiciona sua aptidão para formular projetos, executar obras e prestar contas (GRIN; ABRUCIO, 2018; MARENCO; STROHSCHOEN; JONER, 2017). Essa heterogeneidade é relevante porque os mecanismos de transferência voluntária de recursos pressupõem, em alguma medida, que o ente subnacional disponha de estrutura para acessar e operar os instrumentos disponíveis. Nesse sentido, a desigualdade de capacidades pode reproduzir, no momento da reconstrução, as mesmas assimetrias que tornaram certos municípios mais vulneráveis, de modo que o desastre opera menos como um evento puramente natural e mais como o desfecho de processos sociais e institucionais de longa duração.</w:t>
+        <w:t>A capacidade de responder a um desastre, contudo, não se distribui de maneira uniforme pelo território. A literatura sobre capacidades estatais subnacionais demonstra que os municípios brasileiros têm dotações muito desiguais de recursos administrativos, fiscais e técnicos, o que condiciona sua aptidão para formular projetos, executar obras e prestar contas (GRIN; ABRUCIO, 2018; MARENCO; STROHSCHOEN; JONER, 2017). Como os instrumentos de transferência pressupõem estrutura para operá-los, a desigualdade de capacidades tende a reproduzir, na reconstrução, as assimetrias que tornaram certos municípios mais vulneráveis, de modo que o desastre opera menos como evento puramente natural e mais como desfecho de processos sociais e institucionais de longa duração.</w:t>
       </w:r>
     </w:p>
     <w:p>
@@ -246,7 +376,7 @@
           <w:i w:val="0"/>
           <w:sz w:val="24"/>
         </w:rPr>
-        <w:t>A justificativa do estudo assenta-se em duas ordens de consideração. Do ponto de vista acadêmico, a articulação entre a literatura de capacidades estatais e as técnicas de ciência de dados ainda é incipiente no Brasil, de modo que a aplicação desse instrumental a um problema concreto de política pública contribui para um campo em formação. Do ponto de vista prático, o volume de recursos envolvidos e a recorrência crescente dos desastres tornam imperativo dispor de mecanismos capazes de qualificar tanto a alocação quanto o controle dos gastos. A análise individualizada de milhares de processos excede a capacidade operacional dos órgãos de controle, o que recoloca, em novos termos, a velha tensão entre a amplitude da fiscalização e a escassez dos meios disponíveis para exercê-la.</w:t>
+        <w:t>A justificativa é dupla. No plano acadêmico, a articulação entre a literatura de capacidades estatais e as técnicas de ciência de dados é ainda incipiente no Brasil, de modo que aplicá-las a um problema concreto de política pública contribui para um campo em formação. No plano prático, o volume de recursos e a recorrência dos desastres tornam imperativo qualificar a alocação e o controle dos gastos, tarefa cuja escala excede a análise individualizada pelos órgãos de controle e recoloca a tensão entre a amplitude da fiscalização e a escassez dos meios para exercê-la.</w:t>
       </w:r>
     </w:p>
     <w:p>
@@ -262,7 +392,7 @@
           <w:i w:val="0"/>
           <w:sz w:val="24"/>
         </w:rPr>
-        <w:t>O argumento desenvolvido ao longo do texto sustenta que os indicadores formais de capacidade, embora úteis para a focalização de políticas, capturam de modo apenas parcial o comportamento real dos municípios diante dos desastres, e que a observação desse comportamento por meio de dados transacionais oferece subsídios mais precisos tanto para a alocação quanto para o controle. Esse argumento será sustentado pela convergência de resultados de fases analíticas distintas, que apontam, de maneira independente, para a limitação explicativa do rótulo oficial quando confrontado com o comportamento observado. Cabe registrar que o estudo se apoia em dados administrativos secundários, com as limitações inerentes a essa natureza, e que os modelos aqui apresentados são concebidos como instrumentos de apoio à decisão, e não como substitutos do julgamento técnico.</w:t>
+        <w:t>O argumento que percorre o texto sustenta que os indicadores formais de capacidade, embora úteis para a focalização, capturam apenas parcialmente o comportamento real dos municípios, e que a observação desse comportamento por meio de dados transacionais oferece subsídios mais precisos para a alocação e o controle, tese que a convergência de fases analíticas distintas sustenta. Cabe registrar que o estudo se apoia em dados administrativos secundários, com as limitações inerentes, e que os modelos são concebidos como apoio à decisão, e não como substitutos do julgamento técnico.</w:t>
       </w:r>
     </w:p>
     <w:p>
@@ -376,7 +506,7 @@
           <w:i w:val="0"/>
           <w:sz w:val="24"/>
         </w:rPr>
-        <w:t>Essa distinção entre ameaça e vulnerabilidade é central para a interpretação dos resultados que se seguem. Se o dano decorresse apenas da intensidade física do evento, seria de esperar que a demanda por recursos se distribuísse de modo relativamente independente da capacidade institucional. A constatação de uma associação sistemática entre baixa capacidade e maior demanda sugere, ao contrário, que a vulnerabilidade social e institucional desempenha papel ativo na determinação dos danos. Diante disso, o estudo da reconstrução pós-desastre não pode prescindir de uma leitura que articule as condições materiais de cada município à sua trajetória institucional, sob pena de reduzir um fenômeno social complexo a uma questão meramente técnica de dimensionamento de obras.</w:t>
+        <w:t>Essa distinção entre ameaça e vulnerabilidade é central para a interpretação dos resultados. Se o dano decorresse apenas da intensidade física do evento, a demanda se distribuiria de modo independente da capacidade institucional; a associação sistemática entre baixa capacidade e maior demanda sugere, ao contrário, que a vulnerabilidade social e institucional desempenha papel ativo na determinação dos danos, o que impede reduzir a reconstrução a uma questão meramente técnica de dimensionamento de obras.</w:t>
       </w:r>
     </w:p>
     <w:p>
@@ -392,7 +522,7 @@
           <w:i w:val="0"/>
           <w:sz w:val="24"/>
         </w:rPr>
-        <w:t>A organização federativa brasileira acrescenta complexidade ao quadro. As transferências de recursos para reconstrução articulam competências da União, dos estados e dos municípios, em um arranjo no qual a responsabilidade pela execução recai, em última instância, sobre o ente local, ainda que os recursos e os critérios de elegibilidade sejam definidos em âmbito federal. Esse desenho pressupõe que o município disponha de burocracia capaz de traduzir a necessidade local na linguagem técnica exigida pelos instrumentos de transferência, o que recoloca a questão da capacidade estatal no centro da política. Diante disso, a análise da demanda por reconstrução não pode dissociar-se das condições institucionais em que essa demanda é formulada, sob risco de atribuir ao comportamento do município características que, na verdade, decorrem das regras e dos constrangimentos do próprio arranjo federativo.</w:t>
+        <w:t>A organização federativa acrescenta complexidade: as transferências articulam competências da União, dos estados e dos municípios, mas a execução recai sobre o ente local, ainda que recursos e critérios de elegibilidade sejam definidos em âmbito federal. Esse desenho pressupõe burocracia local capaz de traduzir a necessidade na linguagem técnica exigida, de modo que a análise da demanda não pode dissociar-se das condições institucionais em que ela é formulada.</w:t>
       </w:r>
     </w:p>
     <w:p>
@@ -441,7 +571,7 @@
           <w:i w:val="0"/>
           <w:sz w:val="24"/>
         </w:rPr>
-        <w:t>O exame de grandes volumes de processos, contudo, esbarra em limites práticos do controle tradicional, fundado na análise individualizada de cada solicitação. Diante de milhares de processos e bilhões de reais, a capacidade de escrutínio dos órgãos de controle é necessariamente seletiva, o que reforça a relevância de instrumentos capazes de priorizar casos a partir de critérios objetivos. Sendo assim, a detecção de anomalias em dados de gasto público desponta como estratégia para direcionar a atenção dos auditores aos processos que mais se afastam dos padrões esperados, otimizando o uso de recursos escassos de fiscalização. Essa abordagem não substitui o controle convencional, mas o qualifica, ao permitir que o esforço humano de verificação se concentre nos casos de maior risco potencial, em vez de dispersar-se de modo uniforme por todo o universo de processos.</w:t>
+        <w:t>O exame de grandes volumes, contudo, esbarra nos limites do controle tradicional, fundado na análise individualizada. Diante de milhares de processos e bilhões de reais, o escrutínio é necessariamente seletivo, o que valoriza instrumentos capazes de priorizar casos por critérios objetivos. A detecção de anomalias em dados de gasto desponta, assim, como estratégia para direcionar a atenção dos auditores aos processos mais afastados do padrão, qualificando o controle convencional em vez de substituí-lo.</w:t>
       </w:r>
     </w:p>
     <w:p>
@@ -457,7 +587,7 @@
           <w:i w:val="0"/>
           <w:sz w:val="24"/>
         </w:rPr>
-        <w:t>Importa, no entanto, situar os limites dessa estratégia. A sinalização de um processo como atípico não equivale a um juízo de irregularidade, pois o desvio em relação ao padrão pode decorrer de circunstâncias legítimas, de erros de registro ou, de fato, de práticas irregulares. A confusão entre essas possibilidades pode produzir tanto a estigmatização indevida de gestores honestos quanto a falsa sensação de que o controle algorítmico dispensa o julgamento técnico. Dessa maneira, a incorporação de ferramentas automatizadas ao controle de gastos exige que se preserve, em todas as etapas, o caráter de apoio à decisão, reservando-se ao auditor humano a competência para distinguir, no exame dos casos priorizados, entre o que é apenas incomum e o que é efetivamente irregular.</w:t>
+        <w:t>Importa situar os limites dessa estratégia. A sinalização de um processo como atípico não equivale a juízo de irregularidade, pois o desvio pode decorrer de circunstâncias legítimas, de erros de registro ou de práticas irregulares. Confundir essas possibilidades produz tanto a estigmatização de gestores honestos quanto a falsa sensação de que o algoritmo dispensa o julgamento técnico. A incorporação dessas ferramentas exige, por isso, preservar seu caráter de apoio à decisão, reservando ao auditor a distinção entre o que é apenas incomum e o que é efetivamente irregular.</w:t>
       </w:r>
     </w:p>
     <w:p>
@@ -490,7 +620,7 @@
           <w:i w:val="0"/>
           <w:sz w:val="24"/>
         </w:rPr>
-        <w:t>A incorporação de técnicas de aprendizado de máquina à gestão pública tem se expandido, com aplicações que vão da previsão de demanda por serviços à detecção de fraudes em transações governamentais. Os algoritmos mobilizados neste estudo pertencem a famílias consolidadas na literatura estatística e computacional. O agrupamento por k-médias, formalizado por MacQueen (1967), permite segmentar observações em grupos internamente homogêneos sem rótulos prévios, sendo particularmente útil quando se deseja descobrir padrões latentes em dados não rotulados. As florestas aleatórias, propostas por Breiman (2001), combinam múltiplas árvores de decisão para produzir classificações robustas e estimativas de importância de variáveis, característica que as torna especialmente valiosas em contextos nos quais a interpretabilidade dos determinantes importa tanto quanto a acurácia da predição.</w:t>
+        <w:t>A incorporação de aprendizado de máquina à gestão pública tem se expandido, da previsão de demanda por serviços à detecção de fraudes. Os algoritmos aqui mobilizados pertencem a famílias consolidadas: o agrupamento por k-médias (MACQUEEN, 1967) segmenta observações em grupos homogêneos sem rótulos prévios, e as florestas aleatórias (BREIMAN, 2001) combinam árvores de decisão para produzir classificações robustas e estimativas de importância de variáveis, o que as torna valiosas quando a interpretabilidade importa tanto quanto a acurácia.</w:t>
       </w:r>
     </w:p>
     <w:p>
@@ -506,7 +636,7 @@
           <w:i w:val="0"/>
           <w:sz w:val="24"/>
         </w:rPr>
-        <w:t>Para os objetivos de auditoria, duas técnicas merecem destaque. A regressão quantílica, introduzida por Koenker e Bassett (1978), estima diferentes quantis da distribuição condicional da variável resposta, o que possibilita construir faixas de valores esperados em vez de uma única previsão pontual. Essa propriedade é decisiva para a auditoria, pois permite definir limites inferior e superior dentro dos quais um valor pode ser considerado compatível com casos semelhantes. O gradient boosting, sistematizado por Friedman (2001), constrói modelos preditivos por meio da adição sequencial de estimadores fracos, e pode ser combinado à perda quantílica para gerar tais faixas. A floresta de isolamento, proposta por Liu, Ting e Zhou (2008), identifica observações anômalas a partir da facilidade com que são isoladas em partições aleatórias do espaço de atributos, oferecendo uma via independente para a detecção de casos atípicos.</w:t>
+        <w:t>Para a auditoria, três técnicas importam. A regressão quantílica (KOENKER; BASSETT JR., 1978) estima quantis da distribuição condicional, o que permite construir faixas de valores esperados em vez de uma previsão pontual e, assim, definir limites entre os quais um valor é compatível com casos semelhantes. O gradient boosting (FRIEDMAN, 2001) constrói o modelo pela adição sequencial de estimadores fracos e admite a perda quantílica para gerar essas faixas. A floresta de isolamento (LIU; TING; ZHOU, 2008) identifica anomalias pela facilidade com que uma observação é isolada em partições aleatórias, oferecendo via independente de detecção.</w:t>
       </w:r>
     </w:p>
     <w:p>
@@ -620,7 +750,7 @@
           <w:i w:val="0"/>
           <w:sz w:val="24"/>
         </w:rPr>
-        <w:t>A etapa de engenharia de atributos preparou as variáveis para os modelos. Os valores monetários, marcados por forte assimetria, foram transformados pela função logarítmica (log1p), de modo a aproximar sua distribuição da normalidade e a reduzir o peso desproporcional dos valores extremos. As variáveis categóricas, como unidade da federação e tipo de desastre, foram codificadas numericamente, ao passo que a faixa de capacidade recebeu codificação ordinal, preservando a ordenação entre as faixas. Para a agregação por município, computaram-se o número de processos, o valor total e o valor médio, atributos que sintetizam o comportamento de demanda. A depender do algoritmo, aplicaram-se padronização por escala robusta, mais adequada na presença de valores atípicos, ou padronização convencional, escolha orientada pela sensibilidade de cada técnica aos valores extremos.</w:t>
+        <w:t>A engenharia de atributos preparou as variáveis para os modelos. Os valores monetários, de forte assimetria, foram transformados pela função logarítmica (log1p), para aproximar a distribuição da normalidade e reduzir o peso dos extremos; as variáveis categóricas foram codificadas numericamente e a faixa de capacidade recebeu codificação ordinal. Para a agregação por município, computaram-se o número de processos, o valor total e o valor médio, e aplicou-se, conforme a sensibilidade de cada algoritmo aos valores atípicos, padronização robusta ou convencional.</w:t>
       </w:r>
     </w:p>
     <w:p>
@@ -669,7 +799,7 @@
           <w:i w:val="0"/>
           <w:sz w:val="24"/>
         </w:rPr>
-        <w:t>Na fase de agrupamento, optou-se por quatro grupos, número escolhido para permitir comparação direta com as quatro faixas do índice de capacidade, tendo a métrica de silhueta orientado a avaliação da coesão dos grupos. Os atributos utilizados foram o logaritmo do valor total, o logaritmo do valor médio e o número de processos por município, sobre os quais se aplicou padronização por escala robusta. Na fase de classificação, a variável resposta foi definida de modo binário, distinguindo os processos com recurso transferido (aprovados) daqueles indeferidos, excluídos ou sobrestados (reprovados), enquanto os processos ainda em análise foram excluídos do treinamento. Adotou-se o classificador de florestas aleatórias, com cem estimadores e profundidade máxima limitada, partição dos dados em 80% para treino e 20% para teste, estratificação da variável resposta e ponderação das classes para mitigar o desequilíbrio entre aprovados e reprovados.</w:t>
+        <w:t>Na fase de agrupamento, adotaram-se quatro grupos, para permitir comparação direta com as quatro faixas do índice, com a métrica de silhueta orientando a avaliação da coesão; os atributos foram o logaritmo do valor total, o logaritmo do valor médio e o número de processos, padronizados por escala robusta. Na fase de classificação, a variável resposta foi binária, distinguindo processos com recurso transferido (aprovados) dos indeferidos, excluídos ou sobrestados (reprovados), com os ainda em análise fora do treinamento; empregou-se floresta aleatória com cem estimadores, profundidade limitada, partição 80/20, estratificação e ponderação de classes.</w:t>
       </w:r>
     </w:p>
     <w:p>
@@ -685,7 +815,7 @@
           <w:i w:val="0"/>
           <w:sz w:val="24"/>
         </w:rPr>
-        <w:t>Na fase de regressão preditiva, empregou-se o gradient boosting com perda quantílica para estimar os quantis P10, P50 e P90 do valor solicitado, condicionados à unidade da federação, ao tipo de desastre, à faixa de capacidade, ao grupo comportamental e à faixa populacional. A variável resposta foi o logaritmo do valor, e a análise restringiu-se aos processos aprovados com valores superiores a R$ 1.000, de modo a evitar a contaminação das estimativas por registros residuais. A partir das faixas estimadas, cada processo foi classificado como normal, quando situado entre os limites P10 e P90; baixo, quando inferior ao P10; ou alto, quando superior ao P90, hipótese que sinaliza valor potencialmente superdimensionado. A floresta de isolamento, por fim, foi parametrizada para uma contaminação esperada de 5%, com pré-processamento que combinou padronização e codificação das variáveis categóricas. O quadro a seguir sintetiza as fases, os algoritmos e as métricas de avaliação.</w:t>
+        <w:t>Na regressão preditiva, o gradient boosting com perda quantílica estimou os quantis P10, P50 e P90 do valor solicitado, condicionados à unidade da federação, ao tipo de desastre, à faixa de capacidade, ao grupo comportamental e à faixa populacional; a resposta foi o logaritmo do valor, restrita aos processos aprovados acima de R$ 1.000. Cada processo foi então classificado como normal (entre P10 e P90), baixo (abaixo do P10) ou alto (acima do P90, indício de superdimensionamento). A floresta de isolamento, por fim, usou contaminação esperada de 5%. O quadro a seguir sintetiza as fases, os algoritmos e as métricas.</w:t>
       </w:r>
     </w:p>
     <w:p>
@@ -1261,7 +1391,7 @@
           <w:i w:val="0"/>
           <w:sz w:val="24"/>
         </w:rPr>
-        <w:t>As métricas de avaliação foram escolhidas conforme a natureza de cada tarefa. Para a classificação, privilegiou-se a área sob a curva ROC, métrica robusta ao desequilíbrio entre classes e adequada à comparação entre a capacidade de discriminação do modelo e o acaso. Para a regressão quantílica, adotou-se a cobertura do intervalo entre os quantis estimados, que mede a proporção de observações efetivamente contidas na faixa prevista, complementada pelo coeficiente de determinação no espaço logarítmico. Para o agrupamento, a métrica de silhueta avaliou a coesão interna e a separação entre os grupos. Essa diversidade de métricas reflete a heterogeneidade das tarefas e previne a avaliação inadequada de um modelo por critérios concebidos para outra finalidade.</w:t>
+        <w:t>As métricas acompanham a natureza de cada tarefa: a área sob a curva ROC, robusta ao desequilíbrio entre classes, para a classificação; a cobertura do intervalo entre quantis, complementada pelo coeficiente de determinação no espaço logarítmico, para a regressão quantílica; e a silhueta, para a coesão e a separação dos grupos no agrupamento. Essa diversidade previne a avaliação de um modelo por critérios concebidos para outra finalidade.</w:t>
       </w:r>
     </w:p>
     <w:p>
@@ -1920,22 +2050,6 @@
     </w:p>
     <w:p>
       <w:pPr>
-        <w:spacing w:line="360" w:lineRule="auto" w:after="0" w:before="0"/>
-        <w:ind w:firstLine="709"/>
-        <w:jc w:val="both"/>
-      </w:pPr>
-      <w:r>
-        <w:rPr>
-          <w:rFonts w:ascii="Times New Roman" w:hAnsi="Times New Roman" w:cs="Times New Roman"/>
-          <w:b w:val="0"/>
-          <w:i w:val="0"/>
-          <w:sz w:val="24"/>
-        </w:rPr>
-        <w:t>A dimensão regional do fenômeno adiciona uma camada interpretativa que merece atenção. A concentração de processos em determinadas unidades da federação, com destaque para o Rio Grande do Sul, sugere que os eventos extremos não se distribuem aleatoriamente pelo território, mas seguem padrões geográficos e climáticos que tendem a recair, de modo recorrente, sobre as mesmas regiões. Essa recorrência territorial dialoga com o achado do grupo de alta frequência, identificado na segmentação comportamental, e aponta para a existência de áreas que demandam não apenas respostas reativas a cada desastre, mas estratégias estruturais de prevenção e adaptação. Diante disso, a política de reconstrução, se considerada de forma isolada, arrisca-se a operar como um ciclo de transferências repetidas a territórios cuja vulnerabilidade permanece, no essencial, inalterada entre um evento e o seguinte.</w:t>
-      </w:r>
-    </w:p>
-    <w:p>
-      <w:pPr>
         <w:keepNext/>
         <w:spacing w:line="360" w:lineRule="auto" w:before="240" w:after="120"/>
         <w:ind w:firstLine="0"/>
@@ -2486,7 +2600,7 @@
           <w:i w:val="0"/>
           <w:sz w:val="24"/>
         </w:rPr>
-        <w:t>O caso de Porto Alegre, isolado como grupo autônomo pelo agrupamento, ilustra os limites da análise uniforme. A magnitude e a recorrência de suas solicitações, associadas aos eventos que atingiram a capital gaúcha, produziram um padrão de demanda sem paralelo no conjunto dos municípios, a ponto de a técnica de agrupamento o tratar como categoria própria. Esse resultado evidencia que os grandes centros urbanos podem concentrar, em um único ente, volumes de demanda comparáveis aos de regiões inteiras, o que tensiona os critérios uniformes de análise e sugere a conveniência de tratamentos diferenciados para casos de escala excepcional. Constata-se, assim, que a heterogeneidade dos municípios brasileiros se manifesta não apenas entre faixas de capacidade, mas também no interior de cada faixa, o que reforça a utilidade de abordagens que combinem a classificação estrutural à observação do comportamento.</w:t>
+        <w:t>O caso de Porto Alegre, isolado como grupo autônomo pelo agrupamento, ilustra os limites da análise uniforme. A magnitude e a recorrência de suas solicitações produziram um padrão de demanda sem paralelo, a ponto de a técnica o tratar como categoria própria, o que evidencia que grandes centros urbanos podem concentrar, em um único ente, volumes comparáveis aos de regiões inteiras. A heterogeneidade dos municípios brasileiros manifesta-se, assim, não apenas entre faixas de capacidade, mas também no interior de cada faixa, o que reforça a utilidade de combinar a classificação estrutural à observação do comportamento.</w:t>
       </w:r>
     </w:p>
     <w:p>
@@ -2857,7 +2971,7 @@
           <w:i w:val="0"/>
           <w:sz w:val="24"/>
         </w:rPr>
-        <w:t>O predomínio do valor solicitado como determinante da aprovação comporta uma leitura ambivalente. De um lado, indica que o sistema de análise reage de modo sensível à magnitude dos pedidos, submetendo a maior escrutínio as solicitações que mais se afastam do padrão, o que é coerente com a expectativa de um controle atento ao risco. De outro lado, a centralidade do valor pode sinalizar que outras dimensões relevantes, como a severidade efetiva do evento ou a qualidade técnica do plano de trabalho, encontram-se sub-representadas nos dados disponíveis e, por isso, pesam menos na decisão. Diante dessa ambivalência, o modelo de classificação deve ser compreendido como um espelho do processo decisório existente, capaz de revelar suas regularidades, e não como um padrão normativo do que a decisão deveria ser.</w:t>
+        <w:t>O predomínio do valor solicitado comporta uma leitura ambivalente. De um lado, indica um sistema sensível à magnitude dos pedidos, que submete a maior escrutínio as solicitações mais afastadas do padrão; de outro, pode sinalizar que dimensões relevantes, como a severidade efetiva do evento ou a qualidade técnica do plano, estão sub-representadas nos dados e pesam menos na decisão. O modelo deve, assim, ser lido como espelho do processo decisório existente, capaz de revelar suas regularidades, e não como padrão normativo do que a decisão deveria ser.</w:t>
       </w:r>
     </w:p>
     <w:p>
@@ -2906,7 +3020,7 @@
           <w:i w:val="0"/>
           <w:sz w:val="24"/>
         </w:rPr>
-        <w:t>A aplicação do modelo a 3.893 processos auditados produziu uma classificação automática em três categorias. A maior parte dos processos, correspondente a 66% do total, foi classificada como normal, por situar-se dentro da faixa esperada. Outros 19% foram classificados como baixo, indicando possível subdimensionamento, enquanto 15%, equivalentes a 580 processos, foram classificados como alto, sinalizando valores potencialmente superdimensionados. Esse último conjunto constitui o público prioritário para auditoria, pois concentra os casos que mais se afastam do padrão estimado a partir de processos comparáveis. A categoria de subdimensionamento, por sua vez, embora menos associada ao risco de desperdício, merece atenção por sinalizar a possibilidade de planos incompletos ou de necessidades não plenamente cobertas pelos valores solicitados.</w:t>
+        <w:t>A aplicação do modelo a 3.893 processos auditados produziu uma classificação automática em três categorias. A maior parte dos processos, correspondente a 66% do total, foi classificada como normal, por situar-se dentro da faixa esperada. Outros 19% foram classificados como baixo, indicando possível subdimensionamento, enquanto 15%, equivalentes a 580 processos, foram classificados como alto, sinalizando valores potencialmente superdimensionados. Esse último conjunto constitui o público prioritário para auditoria, pois concentra os casos que mais se afastam do padrão estimado a partir de processos comparáveis.</w:t>
       </w:r>
     </w:p>
     <w:p>
@@ -2922,7 +3036,7 @@
           <w:i w:val="0"/>
           <w:sz w:val="24"/>
         </w:rPr>
-        <w:t>A categoria de subdimensionamento, embora tenha recebido menos atenção na literatura sobre auditoria, encerra implicações relevantes para a efetividade da política. Valores sistematicamente inferiores ao padrão esperado podem indicar planos de trabalho elaborados sob restrição técnica, capacidade limitada de estimar custos ou, ainda, subnotificação de danos por municípios com menor estrutura administrativa. Sob essa perspectiva, o subdimensionamento não é um problema oposto ao superfaturamento, mas uma face complementar da mesma fragilidade institucional, na medida em que ambos remetem à dificuldade de traduzir a necessidade real em uma solicitação tecnicamente consistente. Diante disso, a triagem automatizada presta-se não apenas a coibir excessos, mas também a identificar municípios que poderiam estar deixando de pleitear recursos compatíveis com os danos efetivamente sofridos.</w:t>
+        <w:t>A categoria de subdimensionamento, menos tratada na literatura de auditoria, encerra implicações relevantes: valores sistematicamente inferiores ao padrão podem indicar planos elaborados sob restrição técnica, capacidade limitada de estimar custos ou subnotificação de danos por municípios com menor estrutura. Nesse sentido, o subdimensionamento não se opõe ao superfaturamento, mas é face complementar da mesma fragilidade institucional, e a triagem presta-se também a identificar municípios que talvez deixem de pleitear recursos compatíveis com os danos sofridos.</w:t>
       </w:r>
     </w:p>
     <w:p>
@@ -4306,7 +4420,7 @@
           <w:i w:val="0"/>
           <w:sz w:val="24"/>
         </w:rPr>
-        <w:t>Os resultados convergem para um argumento central: os indicadores formais de capacidade institucional, embora úteis, capturam apenas parcialmente o comportamento dos municípios diante dos desastres. O paradoxo da faixa D, segundo o qual os municípios de menor capacidade concentram a maior parcela dos recursos, pode ser interpretado à luz da produção social da vulnerabilidade (VALENCIO, 2009): a fragilidade institucional, frequentemente associada a infraestrutura precária e a baixa capacidade de prevenção, tende a amplificar os danos quando o evento adverso se materializa. Sob essa leitura, a maior demanda não decorre da capacidade em si, mas das vulnerabilidades que a baixa capacidade ajuda a perpetuar. Cabe reiterar, no entanto, que a elevada influência de valores extremos sobre a média recomenda prudência, pois parte do diferencial observado pode refletir casos atípicos, inclusive erros de registro, o que impõe que a interpretação do paradoxo seja sustentada pela análise conjunta da média e da mediana.</w:t>
+        <w:t>Os resultados convergem para um argumento central: os indicadores formais de capacidade capturam apenas parcialmente o comportamento dos municípios diante dos desastres. O paradoxo da faixa D pode ser lido à luz da produção social da vulnerabilidade (VALENCIO, 2009): a fragilidade institucional, associada a infraestrutura precária e a baixa prevenção, amplifica os danos quando o evento se materializa, de modo que a maior demanda decorre menos da capacidade em si do que das vulnerabilidades que a baixa capacidade perpetua. A forte influência de valores extremos sobre a média, contudo, recomenda que a interpretação do paradoxo se sustente na leitura conjunta da média e da mediana.</w:t>
       </w:r>
     </w:p>
     <w:p>
@@ -4322,7 +4436,7 @@
           <w:i w:val="0"/>
           <w:sz w:val="24"/>
         </w:rPr>
-        <w:t>A constatação de que o grupo comportamental supera a faixa de capacidade na explicação tanto da segmentação quanto da aprovação dos processos tem implicações práticas relevantes. Verifica-se que a observação do comportamento efetivo, derivada de dados transacionais, oferece um substrato informacional mais aderente à realidade do que a classificação oficial isolada. Diante disso, a focalização de políticas de fortalecimento institucional e de mecanismos de monitoramento poderia beneficiar-se da combinação entre o indicador formal e a leitura comportamental, em vez de apoiar-se exclusivamente no primeiro. Essa combinação não significa abandonar o índice de capacidade, cuja função de síntese estrutural permanece válida, mas integrá-lo a uma camada adicional de informação que registra o comportamento concreto de cada município ao longo do tempo.</w:t>
+        <w:t>A constatação de que o grupo comportamental supera a faixa de capacidade na explicação da segmentação e da aprovação tem implicação prática direta: a observação do comportamento efetivo, derivada de dados transacionais, oferece substrato mais aderente à realidade do que a classificação oficial isolada. A focalização de políticas de fortalecimento e de monitoramento beneficiar-se-ia de combinar o indicador formal a essa leitura comportamental, sem abandonar o índice, cuja função de síntese estrutural permanece válida.</w:t>
       </w:r>
     </w:p>
     <w:p>
@@ -4338,7 +4452,7 @@
           <w:i w:val="0"/>
           <w:sz w:val="24"/>
         </w:rPr>
-        <w:t>No que tange à auditoria, os resultados indicam que a triagem algorítmica é viável e potencialmente valiosa para o controle de gastos públicos. A identificação de 580 processos com valores acima do padrão esperado permite direcionar a atenção dos órgãos de controle a um subconjunto gerenciável de casos, em consonância com a lógica de complementaridade entre controle e capacidade seletiva de fiscalização (SPECK, 2002). Importa, contudo, delimitar o alcance dessa contribuição. O baixo coeficiente de determinação do modelo de valor evidencia que as estimativas comportam incerteza substancial, de modo que a sinalização deve ser tomada como hipótese a verificar, e não como veredito. A presença de casos como o de Nova Monte Verde, provável erro de digitação, ilustra que parcela dos alertas decorre de problemas de qualidade dos dados, e não de irregularidades substantivas, o que reforça a indispensabilidade do julgamento humano na etapa de verificação.</w:t>
+        <w:t>No que tange à auditoria, a triagem algorítmica mostra-se viável para o controle de gastos: a identificação de 580 processos acima do padrão esperado concentra a atenção dos órgãos de controle em um subconjunto gerenciável, na lógica de complementaridade entre controle e fiscalização seletiva (SPECK, 2002). Seu alcance, porém, é limitado. O baixo coeficiente de determinação indica incerteza substancial, de modo que a sinalização é hipótese a verificar, e não veredito; e casos como o de Nova Monte Verde, provável erro de digitação, mostram que parte dos alertas decorre da qualidade dos dados, e não de irregularidade, o que reforça a indispensabilidade do julgamento humano.</w:t>
       </w:r>
     </w:p>
     <w:p>
@@ -4386,7 +4500,7 @@
           <w:i w:val="0"/>
           <w:sz w:val="24"/>
         </w:rPr>
-        <w:t>A articulação entre as duas soluções configura um ecossistema que percorre o ciclo completo de gestão de riscos. O motor de previsão atua a montante, nas fases de prevenção, mitigação e preparação, ao antecipar a severidade dos eventos e informar a alocação prévia de recursos; o sistema de inteligência da reconstrução atua a jusante, na fase de recuperação, ao otimizar a destinação das verbas e auditar os processos. Tomadas em conjunto, as ferramentas deslocam a gestão de desastres de um modelo predominantemente reativo, centrado na resposta ao evento já ocorrido, para um modelo proativo, fundado na antecipação e no uso contínuo da informação. Esse deslocamento, contudo, não se realiza apenas pela disponibilidade técnica dos instrumentos, mas depende de sua integração aos arranjos institucionais e às rotinas decisórias dos órgãos competentes, sem a qual a inteligência de dados permanece como potencial não realizado.</w:t>
+        <w:t>A articulação entre as duas soluções percorre o ciclo completo de gestão de riscos: o motor de previsão atua a montante, ao antecipar a severidade e informar a alocação prévia de recursos; o sistema de reconstrução atua a jusante, ao otimizar a destinação das verbas e auditar os processos. Em conjunto, deslocam a gestão de desastres de um modelo reativo para um proativo, deslocamento que, todavia, depende da integração dos instrumentos às rotinas decisórias dos órgãos competentes, sem a qual a inteligência de dados permanece potencial não realizado.</w:t>
       </w:r>
     </w:p>
     <w:p>
@@ -4419,7 +4533,7 @@
           <w:i w:val="0"/>
           <w:sz w:val="24"/>
         </w:rPr>
-        <w:t>Este artigo analisou a relação entre a capacidade institucional municipal e o comportamento de demanda por recursos de reconstrução pós-desastre, além de avaliar a viabilidade de auditoria automatizada desses gastos, a partir de 6.385 processos registrados entre 2017 e 2025. Os resultados evidenciaram que municípios de baixa capacidade concentram a maior parcela dos recursos e exibem valor médio quase três vezes superior ao dos municípios de alta capacidade, ainda que esse diferencial seja fortemente moldado por casos extremos. Demonstrou-se, ademais, que o comportamento efetivo de demanda é mais informativo que o rótulo oficial de capacidade, tanto na segmentação dos municípios quanto na explicação da aprovação dos processos, e que um modelo de triagem foi capaz de sinalizar 580 processos com valores potencialmente superdimensionados.</w:t>
+        <w:t>Este artigo analisou a relação entre a capacidade institucional municipal e o comportamento de demanda por recursos de reconstrução, além da viabilidade de auditoria automatizada desses gastos, a partir de 6.385 processos registrados entre 2017 e 2025. Os achados sustentam que o comportamento efetivo de demanda é mais informativo que o rótulo oficial de capacidade, tanto na segmentação quanto na explicação da aprovação, e que a triagem algorítmica é capaz de priorizar processos para verificação, ainda que sob a ressalva dos casos extremos e da qualidade dos dados.</w:t>
       </w:r>
     </w:p>
     <w:p>

</xml_diff>